<commit_message>
Paper v0.6.1: scientific-paper layout (no README chrome, white only, serif body)
</commit_message>
<xml_diff>
--- a/docs/attrforge.docx
+++ b/docs/attrforge.docx
@@ -27,11 +27,11 @@
           <w:rPr>
             <w:rStyle w:val="Hyperlink"/>
           </w:rPr>
-          <w:t xml:space="preserve">Download .docx</w:t>
+          <w:t xml:space="preserve">.docx</w:t>
         </w:r>
       </w:hyperlink>
     </w:p>
-    <w:bookmarkStart w:id="13" w:name="X2de609c4fadd600df4ff82e716e4156b1fe9cd0"/>
+    <w:bookmarkStart w:id="10" w:name="X2de609c4fadd600df4ff82e716e4156b1fe9cd0"/>
     <w:p>
       <w:pPr>
         <w:pStyle w:val="Title"/>
@@ -55,7 +55,7 @@
         <w:widowControl w:val="1"/>
       </w:pPr>
       <w:r>
-        <w:t xml:space="preserve">We adapt four GAN mode-collapse defenses (PacGAN, MSGAN, ban-list, density-ratio coverage) into a multi-critic LLM prompt-debugging loop. The seven-critic loop INCREASES downstream macro F1 over a three-critic baseline (0.71 vs 0.67) when the downstream classifier is a sentence-transformer, but DECREASES it (0.40 vs 0.58) when the classifier is TF-IDF. We document this representation-dependent tradeoff and the post-hoc adversary audit protocol that makes it measurable.</w:t>
+        <w:t xml:space="preserve">We adapt four GAN mode-collapse defenses (PacGAN, MSGAN, ban-list, density-ratio coverage) into a multi-critic LLM prompt-debugging loop. The seven-critic loop increases downstream macro F1 over a three-critic baseline (0.71 vs 0.67) when the downstream classifier is a sentence-transformer, but decreases it (0.40 vs 0.58) when the classifier is TF-IDF. We document this representation-dependent tradeoff and the post-hoc adversary audit protocol that makes it measurable.</w:t>
       </w:r>
     </w:p>
     <w:p>
@@ -92,7 +92,7 @@
         <w:rPr>
           <w:sz w:val="20"/>
         </w:rPr>
-        <w:t xml:space="preserve">·</w:t>
+        <w:t xml:space="preserve"> </w:t>
       </w:r>
       <w:r>
         <w:rPr>
@@ -131,7 +131,7 @@
         <w:t xml:space="preserve">1</w:t>
       </w:r>
       <w:r>
-        <w:t xml:space="preserve">Holon Institute of Technology, Israel ·</w:t>
+        <w:t xml:space="preserve">Holon Institute of Technology, Israel  </w:t>
       </w:r>
       <w:r>
         <w:t xml:space="preserve"> </w:t>
@@ -155,7 +155,42 @@
         <w:widowControl w:val="1"/>
       </w:pPr>
       <w:r>
-        <w:t xml:space="preserve">Research preview · v0.5 · 2026</w:t>
+        <w:t xml:space="preserve">v0.6 · 2026</w:t>
+      </w:r>
+    </w:p>
+    <w:bookmarkEnd w:id="10"/>
+    <w:bookmarkStart w:id="11" w:name="abstract"/>
+    <w:p>
+      <w:pPr>
+        <w:pStyle w:val="AbstractLabel"/>
+        <w:jc w:val="center"/>
+        <w:keepNext/>
+        <w:keepLines/>
+        <w:widowControl w:val="1"/>
+      </w:pPr>
+      <w:r>
+        <w:t xml:space="preserve">Abstract</w:t>
+      </w:r>
+    </w:p>
+    <w:p>
+      <w:pPr>
+        <w:pStyle w:val="FirstParagraph"/>
+        <w:jc w:val="both"/>
+        <w:keepNext w:val="0"/>
+        <w:keepLines w:val="0"/>
+        <w:widowControl w:val="1"/>
+      </w:pPr>
+      <w:r>
+        <w:t xml:space="preserve">The diversity vs discriminability tradeoff in LLM-generated synthetic data is widely understood as a single-axis question: more variety, harder to classify. We show that the answer depends on the downstream classifier's representation capacity. We adapt four classical GAN mode-collapse defenses (PacGAN, MSGAN, ban-list training, and density-ratio coverage) into a multi-critic prompt-debugging loop combining them with three baseline LLM critics (attribute verifier, per-sample realism discriminator, diversity auditor), giving us a 3-critic baseline and a 7-critic loop that share the same harness and the same generator (</w:t>
+      </w:r>
+      <w:r>
+        <w:rPr>
+          <w:rStyle w:val="VerbatimChar"/>
+        </w:rPr>
+        <w:t xml:space="preserve">gpt-4o-mini</w:t>
+      </w:r>
+      <w:r>
+        <w:t xml:space="preserve">).</w:t>
       </w:r>
     </w:p>
     <w:p>
@@ -166,49 +201,116 @@
         <w:keepLines w:val="0"/>
         <w:widowControl w:val="1"/>
       </w:pPr>
-      <w:hyperlink r:id="rId10">
-        <w:r>
-          <w:rPr>
-            <w:rStyle w:val="Hyperlink"/>
-          </w:rPr>
-          <w:t xml:space="preserve">GitHub</w:t>
-        </w:r>
-      </w:hyperlink>
-      <w:r>
-        <w:t xml:space="preserve"> </w:t>
-      </w:r>
-      <w:hyperlink r:id="rId11">
-        <w:r>
-          <w:rPr>
-            <w:rStyle w:val="Hyperlink"/>
-          </w:rPr>
-          <w:t xml:space="preserve">Full description</w:t>
-        </w:r>
-      </w:hyperlink>
-      <w:r>
-        <w:t xml:space="preserve"> </w:t>
-      </w:r>
-      <w:hyperlink r:id="rId12">
-        <w:r>
-          <w:rPr>
-            <w:rStyle w:val="Hyperlink"/>
-          </w:rPr>
-          <w:t xml:space="preserve">README</w:t>
-        </w:r>
-      </w:hyperlink>
-      <w:r>
-        <w:t xml:space="preserve"> </w:t>
-      </w:r>
-      <w:hyperlink w:anchor="bibtex">
-        <w:r>
-          <w:rPr>
-            <w:rStyle w:val="Hyperlink"/>
-          </w:rPr>
-          <w:t xml:space="preserve">BibTeX</w:t>
-        </w:r>
-      </w:hyperlink>
+      <w:r>
+        <w:t xml:space="preserve">Across 3 random seeds on a customer-support intent classification task, the headline tradeoff</w:t>
+      </w:r>
+      <w:r>
+        <w:t xml:space="preserve"> </w:t>
+      </w:r>
+      <w:r>
+        <w:rPr>
+          <w:i/>
+          <w:iCs/>
+        </w:rPr>
+        <w:t xml:space="preserve">flips direction</w:t>
+      </w:r>
+      <w:r>
+        <w:t xml:space="preserve"> </w:t>
+      </w:r>
+      <w:r>
+        <w:t xml:space="preserve">depending on the downstream classifier (Section 7): with a TF-IDF + logistic-regression classifier, the 3-critic loop achieves</w:t>
+      </w:r>
+      <w:r>
+        <w:t xml:space="preserve"> </w:t>
+      </w:r>
+      <w:r>
+        <w:rPr>
+          <w:b/>
+          <w:bCs/>
+        </w:rPr>
+        <w:t xml:space="preserve">0.58 ± 0.05</w:t>
+      </w:r>
+      <w:r>
+        <w:t xml:space="preserve"> </w:t>
+      </w:r>
+      <w:r>
+        <w:t xml:space="preserve">macro F1 and adding the 4 GAN adversaries drops F1 to</w:t>
+      </w:r>
+      <w:r>
+        <w:t xml:space="preserve"> </w:t>
+      </w:r>
+      <w:r>
+        <w:rPr>
+          <w:b/>
+          <w:bCs/>
+        </w:rPr>
+        <w:t xml:space="preserve">0.40 ± 0.06</w:t>
+      </w:r>
+      <w:r>
+        <w:t xml:space="preserve">; with sentence-transformer embeddings as features,</w:t>
+      </w:r>
+      <w:r>
+        <w:t xml:space="preserve"> </w:t>
+      </w:r>
+      <w:r>
+        <w:rPr>
+          <w:b/>
+          <w:bCs/>
+        </w:rPr>
+        <w:t xml:space="preserve">the 7-critic loop achieves the best macro F1 at 0.71 ± 0.08</w:t>
+      </w:r>
+      <w:r>
+        <w:t xml:space="preserve"> </w:t>
+      </w:r>
+      <w:r>
+        <w:t xml:space="preserve">while the 3-critic baseline drops to</w:t>
+      </w:r>
+      <w:r>
+        <w:t xml:space="preserve"> </w:t>
+      </w:r>
+      <w:r>
+        <w:rPr>
+          <w:b/>
+          <w:bCs/>
+        </w:rPr>
+        <w:t xml:space="preserve">0.67 ± 0.13</w:t>
+      </w:r>
+      <w:r>
+        <w:t xml:space="preserve">. The gap on TF-IDF is consistent across all 3 seeds (paired diffs +0.23, +0.27, +0.07; 95% bootstrap CI [0.07, 0.27]; paired-t p=0.09, Wilcoxon p=0.25 at N=3). The two results together support our central empirical claim: adversarial prompt-debugging injects surface variation that a low-capacity classifier reads as</w:t>
+      </w:r>
+      <w:r>
+        <w:t xml:space="preserve"> </w:t>
+      </w:r>
+      <w:r>
+        <w:rPr>
+          <w:i/>
+          <w:iCs/>
+        </w:rPr>
+        <w:t xml:space="preserve">noise</w:t>
+      </w:r>
+      <w:r>
+        <w:t xml:space="preserve"> </w:t>
+      </w:r>
+      <w:r>
+        <w:t xml:space="preserve">destroying keyword consistency, but that a deeper representation reads as</w:t>
+      </w:r>
+      <w:r>
+        <w:t xml:space="preserve"> </w:t>
+      </w:r>
+      <w:r>
+        <w:rPr>
+          <w:i/>
+          <w:iCs/>
+        </w:rPr>
+        <w:t xml:space="preserve">data</w:t>
+      </w:r>
+      <w:r>
+        <w:t xml:space="preserve"> </w:t>
+      </w:r>
+      <w:r>
+        <w:t xml:space="preserve">covering more of the linguistic surface of real customer messages.</w:t>
+      </w:r>
     </w:p>
-    <w:bookmarkEnd w:id="13"/>
     <w:p>
       <w:pPr>
         <w:pStyle w:val="BodyText"/>
@@ -218,182 +320,6 @@
         <w:widowControl w:val="1"/>
       </w:pPr>
       <w:r>
-        <w:t xml:space="preserve">AttrForge hero image: a forge anvil with a glowing crystalline prompt above it, surrounded by three luminous critic spirits (cyan attribute verifier, amber diversity auditor, magenta realism discriminator) sending structured feedback streams back into the prompt.</w:t>
-      </w:r>
-    </w:p>
-    <w:p>
-      <w:pPr>
-        <w:pStyle w:val="BodyText"/>
-        <w:jc w:val="both"/>
-        <w:keepNext w:val="0"/>
-        <w:keepLines w:val="0"/>
-        <w:widowControl w:val="1"/>
-      </w:pPr>
-      <w:r>
-        <w:t xml:space="preserve">The AttrForge loop: critics judge the synthetic batch, and their structured feedback is the "gradient" that rewrites the generator prompt.</w:t>
-      </w:r>
-    </w:p>
-    <w:bookmarkStart w:id="14" w:name="abstract"/>
-    <w:p>
-      <w:pPr>
-        <w:pStyle w:val="AbstractLabel"/>
-        <w:jc w:val="center"/>
-        <w:keepNext/>
-        <w:keepLines/>
-        <w:widowControl w:val="1"/>
-      </w:pPr>
-      <w:r>
-        <w:t xml:space="preserve">Abstract</w:t>
-      </w:r>
-    </w:p>
-    <w:p>
-      <w:pPr>
-        <w:pStyle w:val="FirstParagraph"/>
-        <w:jc w:val="both"/>
-        <w:keepNext w:val="0"/>
-        <w:keepLines w:val="0"/>
-        <w:widowControl w:val="1"/>
-      </w:pPr>
-      <w:r>
-        <w:t xml:space="preserve">The diversity vs discriminability tradeoff in LLM-generated synthetic data is widely understood as a single-axis question: more variety, harder to classify. We show that the answer depends on the downstream classifier's representation capacity. We adapt four classical GAN mode-collapse defenses (PacGAN, MSGAN, ban-list training, and density-ratio coverage) into a multi-critic prompt-debugging loop combining them with three baseline LLM critics (attribute verifier, per-sample realism discriminator, diversity auditor), giving us a 3-critic baseline and a 7-critic loop that share the same harness and the same generator (</w:t>
-      </w:r>
-      <w:r>
-        <w:rPr>
-          <w:rStyle w:val="VerbatimChar"/>
-        </w:rPr>
-        <w:t xml:space="preserve">gpt-4o-mini</w:t>
-      </w:r>
-      <w:r>
-        <w:t xml:space="preserve">).</w:t>
-      </w:r>
-    </w:p>
-    <w:p>
-      <w:pPr>
-        <w:pStyle w:val="BodyText"/>
-        <w:jc w:val="both"/>
-        <w:keepNext w:val="0"/>
-        <w:keepLines w:val="0"/>
-        <w:widowControl w:val="1"/>
-      </w:pPr>
-      <w:r>
-        <w:t xml:space="preserve">Across 3 random seeds on a customer-support intent classification task, the headline tradeoff</w:t>
-      </w:r>
-      <w:r>
-        <w:t xml:space="preserve"> </w:t>
-      </w:r>
-      <w:r>
-        <w:rPr>
-          <w:i/>
-          <w:iCs/>
-        </w:rPr>
-        <w:t xml:space="preserve">flips direction</w:t>
-      </w:r>
-      <w:r>
-        <w:t xml:space="preserve"> </w:t>
-      </w:r>
-      <w:r>
-        <w:t xml:space="preserve">depending on the downstream classifier (Section 7): with a TF-IDF + logistic-regression classifier, the 3-critic loop achieves</w:t>
-      </w:r>
-      <w:r>
-        <w:t xml:space="preserve"> </w:t>
-      </w:r>
-      <w:r>
-        <w:rPr>
-          <w:b/>
-          <w:bCs/>
-        </w:rPr>
-        <w:t xml:space="preserve">0.58 ± 0.05</w:t>
-      </w:r>
-      <w:r>
-        <w:t xml:space="preserve"> </w:t>
-      </w:r>
-      <w:r>
-        <w:t xml:space="preserve">macro F1 and adding the 4 GAN adversaries drops F1 to</w:t>
-      </w:r>
-      <w:r>
-        <w:t xml:space="preserve"> </w:t>
-      </w:r>
-      <w:r>
-        <w:rPr>
-          <w:b/>
-          <w:bCs/>
-        </w:rPr>
-        <w:t xml:space="preserve">0.40 ± 0.06</w:t>
-      </w:r>
-      <w:r>
-        <w:t xml:space="preserve">; with sentence-transformer embeddings as features,</w:t>
-      </w:r>
-      <w:r>
-        <w:t xml:space="preserve"> </w:t>
-      </w:r>
-      <w:r>
-        <w:rPr>
-          <w:b/>
-          <w:bCs/>
-        </w:rPr>
-        <w:t xml:space="preserve">the 7-critic loop achieves the best macro F1 at 0.71 ± 0.08</w:t>
-      </w:r>
-      <w:r>
-        <w:t xml:space="preserve"> </w:t>
-      </w:r>
-      <w:r>
-        <w:t xml:space="preserve">while the 3-critic baseline drops to</w:t>
-      </w:r>
-      <w:r>
-        <w:t xml:space="preserve"> </w:t>
-      </w:r>
-      <w:r>
-        <w:rPr>
-          <w:b/>
-          <w:bCs/>
-        </w:rPr>
-        <w:t xml:space="preserve">0.67 ± 0.13</w:t>
-      </w:r>
-      <w:r>
-        <w:t xml:space="preserve">. The gap on TF-IDF is consistent across all 3 seeds (paired diffs +0.23, +0.27, +0.07; 95% bootstrap CI [0.07, 0.27]; paired-t p=0.09, Wilcoxon p=0.25 at N=3). The two results together support our central empirical claim: adversarial prompt-debugging injects surface variation that a low-capacity classifier reads as</w:t>
-      </w:r>
-      <w:r>
-        <w:t xml:space="preserve"> </w:t>
-      </w:r>
-      <w:r>
-        <w:rPr>
-          <w:i/>
-          <w:iCs/>
-        </w:rPr>
-        <w:t xml:space="preserve">noise</w:t>
-      </w:r>
-      <w:r>
-        <w:t xml:space="preserve"> </w:t>
-      </w:r>
-      <w:r>
-        <w:t xml:space="preserve">destroying keyword consistency, but that a deeper representation reads as</w:t>
-      </w:r>
-      <w:r>
-        <w:t xml:space="preserve"> </w:t>
-      </w:r>
-      <w:r>
-        <w:rPr>
-          <w:i/>
-          <w:iCs/>
-        </w:rPr>
-        <w:t xml:space="preserve">data</w:t>
-      </w:r>
-      <w:r>
-        <w:t xml:space="preserve"> </w:t>
-      </w:r>
-      <w:r>
-        <w:t xml:space="preserve">covering more of the linguistic surface of real customer messages.</w:t>
-      </w:r>
-    </w:p>
-    <w:p>
-      <w:pPr>
-        <w:pStyle w:val="BodyText"/>
-        <w:jc w:val="both"/>
-        <w:keepNext w:val="0"/>
-        <w:keepLines w:val="0"/>
-        <w:widowControl w:val="1"/>
-      </w:pPr>
-      <w:r>
         <w:t xml:space="preserve">Beyond this main result we release: (i) the open-source seven-critic harness with a single-flag-per-critic ablation contract; (ii) a</w:t>
       </w:r>
       <w:r>
@@ -429,8 +355,8 @@
         <w:t xml:space="preserve">from chance under iteration; Coverage Hole Finder AUROC remains at 1.00 for every condition); and (v) per-iteration on-disk manifests sufficient for byte-for-byte reproduction.</w:t>
       </w:r>
     </w:p>
-    <w:bookmarkEnd w:id="14"/>
-    <w:bookmarkStart w:id="15" w:name="contents"/>
+    <w:bookmarkEnd w:id="11"/>
+    <w:bookmarkStart w:id="12" w:name="contents"/>
     <w:p>
       <w:pPr>
         <w:pStyle w:val="Heading3"/>
@@ -673,8 +599,8 @@
         </w:r>
       </w:hyperlink>
     </w:p>
-    <w:bookmarkEnd w:id="15"/>
-    <w:bookmarkStart w:id="16" w:name="sec-introduction"/>
+    <w:bookmarkEnd w:id="12"/>
+    <w:bookmarkStart w:id="13" w:name="sec-introduction"/>
     <w:p>
       <w:pPr>
         <w:pStyle w:val="Heading2"/>
@@ -1298,8 +1224,8 @@
         <w:t xml:space="preserve">with a downstream evaluator that ships three classifier choices by default, three backends (OpenAI, Anthropic, deterministic simulator), per-iteration on-disk manifests, and a complaint-grammar contract that lets future work add new critics without breaking the audit protocol.</w:t>
       </w:r>
     </w:p>
-    <w:bookmarkEnd w:id="16"/>
-    <w:bookmarkStart w:id="27" w:name="sec-related"/>
+    <w:bookmarkEnd w:id="13"/>
+    <w:bookmarkStart w:id="24" w:name="sec-related"/>
     <w:p>
       <w:pPr>
         <w:pStyle w:val="Heading2"/>
@@ -1314,7 +1240,7 @@
         <w:t xml:space="preserve">Related work</w:t>
       </w:r>
     </w:p>
-    <w:bookmarkStart w:id="17" w:name="synthetic-data-generation-with-llms"/>
+    <w:bookmarkStart w:id="14" w:name="synthetic-data-generation-with-llms"/>
     <w:p>
       <w:pPr>
         <w:pStyle w:val="Heading3"/>
@@ -1437,8 +1363,8 @@
         <w:t xml:space="preserve">use a large LLM to distill structured knowledge into a smaller model. Our framing inherits the iterative-rewrite idea but argues that single-critic feedback (self-critique) systematically underconstrains the rewrite, especially for diversity, which is what motivates our multi-objective setup.</w:t>
       </w:r>
     </w:p>
-    <w:bookmarkEnd w:id="17"/>
-    <w:bookmarkStart w:id="18" w:name="X23196f5ae01e534c9569b7eff61e457d49f9d2a"/>
+    <w:bookmarkEnd w:id="14"/>
+    <w:bookmarkStart w:id="15" w:name="X23196f5ae01e534c9569b7eff61e457d49f9d2a"/>
     <w:p>
       <w:pPr>
         <w:pStyle w:val="Heading3"/>
@@ -1624,8 +1550,8 @@
         <w:t xml:space="preserve">AttrForge differs from this line in three ways. First, our objective is structurally multi-axis: seven critics (three baseline plus four mode-collapse adversaries) each emit named, falsifiable complaints rather than scalar rewards. Second, the updater is asked to satisfy them jointly under a length budget rather than through scalarization. Third, we explicitly transfer batch-level defenses from the GAN literature, which to our knowledge no prior prompt-optimization work has done.</w:t>
       </w:r>
     </w:p>
-    <w:bookmarkEnd w:id="18"/>
-    <w:bookmarkStart w:id="19" w:name="bmulti-critic-and-debate-style-judges"/>
+    <w:bookmarkEnd w:id="15"/>
+    <w:bookmarkStart w:id="16" w:name="bmulti-critic-and-debate-style-judges"/>
     <w:p>
       <w:pPr>
         <w:pStyle w:val="Heading3"/>
@@ -1669,8 +1595,8 @@
         <w:t xml:space="preserve">formally proves that debate amplifies judge correctness over static ensembles and introduces adaptive Beta-Binomial stopping rules. This is complementary to our work: debate adds deliberation between judges, while we add adversarial batch-level dynamics. Our seven critics are intentionally independent rather than deliberative; combining the two paradigms is a natural extension.</w:t>
       </w:r>
     </w:p>
-    <w:bookmarkEnd w:id="19"/>
-    <w:bookmarkStart w:id="20" w:name="llm-as-judge"/>
+    <w:bookmarkEnd w:id="16"/>
+    <w:bookmarkStart w:id="17" w:name="llm-as-judge"/>
     <w:p>
       <w:pPr>
         <w:pStyle w:val="Heading3"/>
@@ -1764,8 +1690,8 @@
         <w:t xml:space="preserve">complaints rather than free-form prose.</w:t>
       </w:r>
     </w:p>
-    <w:bookmarkEnd w:id="20"/>
-    <w:bookmarkStart w:id="21" w:name="Xde87835405e4957e6af80978c52d29d253068b2"/>
+    <w:bookmarkEnd w:id="17"/>
+    <w:bookmarkStart w:id="18" w:name="Xde87835405e4957e6af80978c52d29d253068b2"/>
     <w:p>
       <w:pPr>
         <w:pStyle w:val="Heading3"/>
@@ -1904,8 +1830,8 @@
         <w:t xml:space="preserve">. We adapt four of these defenses into a prompt-debugging setting where the generator's parameters are frozen and the optimized object is the prompt.</w:t>
       </w:r>
     </w:p>
-    <w:bookmarkEnd w:id="21"/>
-    <w:bookmarkStart w:id="22" w:name="bmode-collapse-in-llm-outputs"/>
+    <w:bookmarkEnd w:id="18"/>
+    <w:bookmarkStart w:id="19" w:name="bmode-collapse-in-llm-outputs"/>
     <w:p>
       <w:pPr>
         <w:pStyle w:val="Heading3"/>
@@ -1966,8 +1892,8 @@
         <w:t xml:space="preserve">is the closest existing GAN-style framework for LLM data: it pairs an attacker LLM and a defender LLM under a tool-augmented judge to generate targeted training examples. Our work differs from NanoFlux in two ways: we use multiple critics rather than a single judge, and our adversaries are structural transfers from specific GAN defenses rather than free-form attackers.</w:t>
       </w:r>
     </w:p>
-    <w:bookmarkEnd w:id="22"/>
-    <w:bookmarkStart w:id="23" w:name="X68e9557b060ae0dd639d483d298feb766007b6b"/>
+    <w:bookmarkEnd w:id="19"/>
+    <w:bookmarkStart w:id="20" w:name="X68e9557b060ae0dd639d483d298feb766007b6b"/>
     <w:p>
       <w:pPr>
         <w:pStyle w:val="Heading3"/>
@@ -2062,8 +1988,8 @@
         <w:t xml:space="preserve">is another defense thread that connects to our Coverage Hole Finder's density-ratio classifier.</w:t>
       </w:r>
     </w:p>
-    <w:bookmarkEnd w:id="23"/>
-    <w:bookmarkStart w:id="24" w:name="X9530a24de0c8077420815eff986b491df29f2a3"/>
+    <w:bookmarkEnd w:id="20"/>
+    <w:bookmarkStart w:id="21" w:name="X9530a24de0c8077420815eff986b491df29f2a3"/>
     <w:p>
       <w:pPr>
         <w:pStyle w:val="Heading3"/>
@@ -2107,8 +2033,8 @@
         <w:t xml:space="preserve">aggregates multiple density-ratio estimators with diverse hyperparameter settings to produce global and local quality scores, providing a direct technical antecedent for our Coverage Hole Finder.</w:t>
       </w:r>
     </w:p>
-    <w:bookmarkEnd w:id="24"/>
-    <w:bookmarkStart w:id="25" w:name="X681a7ad306724b4daa41b63d7d89643e419e7b6"/>
+    <w:bookmarkEnd w:id="21"/>
+    <w:bookmarkStart w:id="22" w:name="X681a7ad306724b4daa41b63d7d89643e419e7b6"/>
     <w:p>
       <w:pPr>
         <w:pStyle w:val="Heading3"/>
@@ -2152,8 +2078,8 @@
         <w:t xml:space="preserve">decomposes embedding-based diversity into prompt-driven and intrinsic-model components via a Schur-complement decomposition of CLIP-embedding kernels; this is the closest 2024 alternative to distinct-n and FID for text diversity. Our Mode-Seeking ratio occupies a similar niche but is conditioned on attribute-vector distance rather than prompt identity.</w:t>
       </w:r>
     </w:p>
-    <w:bookmarkEnd w:id="25"/>
-    <w:bookmarkStart w:id="26" w:name="density-ratio-estimation"/>
+    <w:bookmarkEnd w:id="22"/>
+    <w:bookmarkStart w:id="23" w:name="density-ratio-estimation"/>
     <w:p>
       <w:pPr>
         <w:pStyle w:val="Heading3"/>
@@ -2342,9 +2268,9 @@
         <w:t xml:space="preserve">to surface concrete real exemplars that the synthetic distribution fails to cover, which become few-shot anchors in the next generator prompt.</w:t>
       </w:r>
     </w:p>
-    <w:bookmarkEnd w:id="26"/>
-    <w:bookmarkEnd w:id="27"/>
-    <w:bookmarkStart w:id="28" w:name="sec-problem"/>
+    <w:bookmarkEnd w:id="23"/>
+    <w:bookmarkEnd w:id="24"/>
+    <w:bookmarkStart w:id="25" w:name="sec-problem"/>
     <w:p>
       <w:pPr>
         <w:pStyle w:val="Heading2"/>
@@ -3546,8 +3472,8 @@
         <w:t xml:space="preserve">Optimizing the prompt rather than the model weights yields four practical advantages: (i) zero parameter footprint, (ii) inspectable optimization trajectory (every prompt version is a reviewable text artifact), (iii) immediate applicability to closed-weights models, and (iv) cheap multi-seed re-runs (no GPU required).</w:t>
       </w:r>
     </w:p>
-    <w:bookmarkEnd w:id="28"/>
-    <w:bookmarkStart w:id="33" w:name="sec-method"/>
+    <w:bookmarkEnd w:id="25"/>
+    <w:bookmarkStart w:id="30" w:name="sec-method"/>
     <w:p>
       <w:pPr>
         <w:pStyle w:val="Heading2"/>
@@ -3642,7 +3568,7 @@
         <w:t>The AttrForge optimization loop. The attribute planner emits target attribute vectors  that condition the generator. The seven critic stack evaluates the resulting samples  along orthogonal axes (three baseline critics, four GAN-style adversaries highlighted in gray); each emits structured named complaints. The prompt updater rewrites the generator prompt  under a length budget, closing the loop. A downstream evaluator (right) trains a classifier on the final synthetic batch and tests it on held-out real data.</w:t>
       </w:r>
     </w:p>
-    <w:bookmarkStart w:id="29" w:name="attribute-planner"/>
+    <w:bookmarkStart w:id="26" w:name="attribute-planner"/>
     <w:p>
       <w:pPr>
         <w:pStyle w:val="Heading3"/>
@@ -3879,8 +3805,8 @@
         <w:t xml:space="preserve">The planner currently considers two-attribute pairs only; extension to higher-order combinations is straightforward but unimplemented.</w:t>
       </w:r>
     </w:p>
-    <w:bookmarkEnd w:id="29"/>
-    <w:bookmarkStart w:id="30" w:name="generator"/>
+    <w:bookmarkEnd w:id="26"/>
+    <w:bookmarkStart w:id="27" w:name="generator"/>
     <w:p>
       <w:pPr>
         <w:pStyle w:val="Heading3"/>
@@ -3927,8 +3853,8 @@
         <w:t xml:space="preserve">, a refreshed random sample of real examples for few-shot anchoring, the schema, and the target attributes; it returns a JSON object with the sample text and the realized attributes. Sample-by-sample (not batched) generation is chosen so that per-sample temperature variance contributes to surface diversity and so the verifier and the discriminator receive per-sample IDs to return verdicts against.</w:t>
       </w:r>
     </w:p>
-    <w:bookmarkEnd w:id="30"/>
-    <w:bookmarkStart w:id="31" w:name="three-baseline-critics"/>
+    <w:bookmarkEnd w:id="27"/>
+    <w:bookmarkStart w:id="28" w:name="three-baseline-critics"/>
     <w:p>
       <w:pPr>
         <w:pStyle w:val="Heading3"/>
@@ -4062,8 +3988,8 @@
         <w:t xml:space="preserve">, computed over TF-IDF features in our default configuration; sentence-transformer embeddings are an opt-in) plus an optional LLM judgment layer returning missing modes, overrepresented modes, and recommendations.</w:t>
       </w:r>
     </w:p>
-    <w:bookmarkEnd w:id="31"/>
-    <w:bookmarkStart w:id="32" w:name="prompt-updater"/>
+    <w:bookmarkEnd w:id="28"/>
+    <w:bookmarkStart w:id="29" w:name="prompt-updater"/>
     <w:p>
       <w:pPr>
         <w:pStyle w:val="Heading3"/>
@@ -5106,9 +5032,9 @@
         <w:t xml:space="preserve">The structured contract is what makes batch-level adversaries integrate cleanly into the same template as per-sample critics: every critic's output is a list of named items that the updater is asked to address one-by-one.</w:t>
       </w:r>
     </w:p>
-    <w:bookmarkEnd w:id="32"/>
-    <w:bookmarkEnd w:id="33"/>
-    <w:bookmarkStart w:id="38" w:name="sec-adversaries"/>
+    <w:bookmarkEnd w:id="29"/>
+    <w:bookmarkEnd w:id="30"/>
+    <w:bookmarkStart w:id="35" w:name="sec-adversaries"/>
     <w:p>
       <w:pPr>
         <w:pStyle w:val="Heading2"/>
@@ -5167,7 +5093,7 @@
         <w:t xml:space="preserve">(the generator emits roughly the same text regardless of the requested attribute vector, while metadata correctly reflects it). We address both via a 2 × 2 grid: Pack Discriminator and Mode-Seeking target plausible homogeneity and attribute-deafness respectively; Mode Hunter and Coverage Hole Finder add cross-iteration memory and exemplar grounding.</w:t>
       </w:r>
     </w:p>
-    <w:bookmarkStart w:id="34" w:name="sec-pack"/>
+    <w:bookmarkStart w:id="31" w:name="sec-pack"/>
     <w:p>
       <w:pPr>
         <w:pStyle w:val="Heading3"/>
@@ -5375,8 +5301,8 @@
         <w:t xml:space="preserve">it used (opener repetition, structural tics, phrase repetition); these are aggregated into a list that the updater renders as named complaints.</w:t>
       </w:r>
     </w:p>
-    <w:bookmarkEnd w:id="34"/>
-    <w:bookmarkStart w:id="35" w:name="sec-msgan"/>
+    <w:bookmarkEnd w:id="31"/>
+    <w:bookmarkStart w:id="32" w:name="sec-msgan"/>
     <w:p>
       <w:pPr>
         <w:pStyle w:val="Heading3"/>
@@ -5556,8 +5482,8 @@
         <w:t xml:space="preserve">indicate attribute-deaf generation. We additionally report a per-attribute sensitivity matrix.</w:t>
       </w:r>
     </w:p>
-    <w:bookmarkEnd w:id="35"/>
-    <w:bookmarkStart w:id="36" w:name="sec-hunter"/>
+    <w:bookmarkEnd w:id="32"/>
+    <w:bookmarkStart w:id="33" w:name="sec-hunter"/>
     <w:p>
       <w:pPr>
         <w:pStyle w:val="Heading3"/>
@@ -5738,8 +5664,8 @@
         <w:t xml:space="preserve">. Every previously identified failure pattern is rendered into the next generator prompt as a "do not use" instruction. A cap of 50 entries bounds prompt bloat.</w:t>
       </w:r>
     </w:p>
-    <w:bookmarkEnd w:id="36"/>
-    <w:bookmarkStart w:id="37" w:name="sec-cov-hole"/>
+    <w:bookmarkEnd w:id="33"/>
+    <w:bookmarkStart w:id="34" w:name="sec-cov-hole"/>
     <w:p>
       <w:pPr>
         <w:pStyle w:val="Heading3"/>
@@ -5950,9 +5876,9 @@
         <w:t xml:space="preserve">.</w:t>
       </w:r>
     </w:p>
-    <w:bookmarkEnd w:id="37"/>
-    <w:bookmarkEnd w:id="38"/>
-    <w:bookmarkStart w:id="43" w:name="sec-experiments"/>
+    <w:bookmarkEnd w:id="34"/>
+    <w:bookmarkEnd w:id="35"/>
+    <w:bookmarkStart w:id="40" w:name="sec-experiments"/>
     <w:p>
       <w:pPr>
         <w:pStyle w:val="Heading2"/>
@@ -5967,7 +5893,7 @@
         <w:t xml:space="preserve">Experimental setup</w:t>
       </w:r>
     </w:p>
-    <w:bookmarkStart w:id="39" w:name="task-and-dataset"/>
+    <w:bookmarkStart w:id="36" w:name="task-and-dataset"/>
     <w:p>
       <w:pPr>
         <w:pStyle w:val="Heading3"/>
@@ -6133,8 +6059,8 @@
         <w:t xml:space="preserve">are available to the generator as few-shot anchors and to the critics as the "real" half of every comparison.</w:t>
       </w:r>
     </w:p>
-    <w:bookmarkEnd w:id="39"/>
-    <w:bookmarkStart w:id="40" w:name="backends"/>
+    <w:bookmarkEnd w:id="36"/>
+    <w:bookmarkStart w:id="37" w:name="backends"/>
     <w:p>
       <w:pPr>
         <w:pStyle w:val="Heading3"/>
@@ -6288,8 +6214,8 @@
         <w:t xml:space="preserve">as both generator and every critic (3 seeds, 7 conditions, 3 iterations of 16 samples, total 21 condition-runs). The simulator backend remains in the repository as a deterministic harness validator and a CI-friendly offline mode; it is not used for headline numbers. A previous draft of this paper used simulator numbers; the present revision is the live-LLM run.</w:t>
       </w:r>
     </w:p>
-    <w:bookmarkEnd w:id="40"/>
-    <w:bookmarkStart w:id="41" w:name="conditions"/>
+    <w:bookmarkEnd w:id="37"/>
+    <w:bookmarkStart w:id="38" w:name="conditions"/>
     <w:p>
       <w:pPr>
         <w:pStyle w:val="Heading3"/>
@@ -8751,8 +8677,8 @@
         <w:t xml:space="preserve">python scripts/aggregate_multiseed.py --base main_run_002</w:t>
       </w:r>
     </w:p>
-    <w:bookmarkEnd w:id="41"/>
-    <w:bookmarkStart w:id="42" w:name="metrics"/>
+    <w:bookmarkEnd w:id="38"/>
+    <w:bookmarkStart w:id="39" w:name="metrics"/>
     <w:p>
       <w:pPr>
         <w:pStyle w:val="Heading3"/>
@@ -8811,9 +8737,9 @@
         <w:t xml:space="preserve">), pack accuracy, mode-seeking ratio, banned-phrasing library size, coverage classifier AUROC, and downstream RQ4 metrics (TF-IDF + logistic regression trained on synthetic, evaluated on the held-out real test split).</w:t>
       </w:r>
     </w:p>
-    <w:bookmarkEnd w:id="42"/>
-    <w:bookmarkEnd w:id="43"/>
-    <w:bookmarkStart w:id="49" w:name="sec-results"/>
+    <w:bookmarkEnd w:id="39"/>
+    <w:bookmarkEnd w:id="40"/>
+    <w:bookmarkStart w:id="46" w:name="sec-results"/>
     <w:p>
       <w:pPr>
         <w:pStyle w:val="Heading2"/>
@@ -8828,7 +8754,7 @@
         <w:t xml:space="preserve">Results</w:t>
       </w:r>
     </w:p>
-    <w:bookmarkStart w:id="44" w:name="Xd6ecf73e398069f412ff59b3fb4a53fba6e3980"/>
+    <w:bookmarkStart w:id="41" w:name="Xd6ecf73e398069f412ff59b3fb4a53fba6e3980"/>
     <w:p>
       <w:pPr>
         <w:pStyle w:val="Heading3"/>
@@ -10686,8 +10612,8 @@
         <w:t>Downstream classifier accuracy and macro F1 with TF-IDF + logistic regression, mean ± std across 3 random seeds. full_classic achieves the best F1 (0.58 ± 0.05); full_attrforge drops to 0.40 ± 0.06. The 0.18 gap on TF-IDF is the headline of the first half of our story.</w:t>
       </w:r>
     </w:p>
-    <w:bookmarkEnd w:id="44"/>
-    <w:bookmarkStart w:id="45" w:name="Xc473a98b2b9bff62d7358977afe4fab2bccf298"/>
+    <w:bookmarkEnd w:id="41"/>
+    <w:bookmarkStart w:id="42" w:name="Xc473a98b2b9bff62d7358977afe4fab2bccf298"/>
     <w:p>
       <w:pPr>
         <w:pStyle w:val="Heading3"/>
@@ -12068,8 +11994,8 @@
         <w:t xml:space="preserve">) and downstream metrics.</w:t>
       </w:r>
     </w:p>
-    <w:bookmarkEnd w:id="45"/>
-    <w:bookmarkStart w:id="46" w:name="realism-trajectory"/>
+    <w:bookmarkEnd w:id="42"/>
+    <w:bookmarkStart w:id="43" w:name="realism-trajectory"/>
     <w:p>
       <w:pPr>
         <w:pStyle w:val="Heading3"/>
@@ -12164,8 +12090,8 @@
         <w:t>Realism discriminator accuracy on the mixed batch. Chance level () is the target. Conditions without a realism discriminator default to chance because the metric is not computed. Among conditions where the discriminator runs, full_attrforge drives accuracy closest to chance.</w:t>
       </w:r>
     </w:p>
-    <w:bookmarkEnd w:id="46"/>
-    <w:bookmarkStart w:id="47" w:name="per-iteration-trajectory"/>
+    <w:bookmarkEnd w:id="43"/>
+    <w:bookmarkStart w:id="44" w:name="per-iteration-trajectory"/>
     <w:p>
       <w:pPr>
         <w:pStyle w:val="Heading3"/>
@@ -12357,8 +12283,8 @@
         <w:t xml:space="preserve">on downstream F1 in this setting; we claim it dominates on the realism axis (Section 7.2) and on every post-hoc adversary metric (Section 8).</w:t>
       </w:r>
     </w:p>
-    <w:bookmarkEnd w:id="47"/>
-    <w:bookmarkStart w:id="48" w:name="per-class-f1"/>
+    <w:bookmarkEnd w:id="44"/>
+    <w:bookmarkStart w:id="45" w:name="per-class-f1"/>
     <w:p>
       <w:pPr>
         <w:pStyle w:val="Heading3"/>
@@ -12453,9 +12379,9 @@
         <w:t>Per-class F1 on the held-out real test set (single representative seed). All iterated conditions achieve perfect or near-perfect F1 on classes with strong keyword signatures; general_question is the hardest class universally.</w:t>
       </w:r>
     </w:p>
-    <w:bookmarkEnd w:id="48"/>
-    <w:bookmarkEnd w:id="49"/>
-    <w:bookmarkStart w:id="50" w:name="sec-audit"/>
+    <w:bookmarkEnd w:id="45"/>
+    <w:bookmarkEnd w:id="46"/>
+    <w:bookmarkStart w:id="47" w:name="sec-audit"/>
     <w:p>
       <w:pPr>
         <w:pStyle w:val="Heading2"/>
@@ -14790,8 +14716,8 @@
         <w:t xml:space="preserve">improvement on the discriminator metric. The tradeoff is concrete and quantifiable; it is also small relative to the cross-seed standard deviation.</w:t>
       </w:r>
     </w:p>
-    <w:bookmarkEnd w:id="50"/>
-    <w:bookmarkStart w:id="57" w:name="sec-discussion"/>
+    <w:bookmarkEnd w:id="47"/>
+    <w:bookmarkStart w:id="54" w:name="sec-discussion"/>
     <w:p>
       <w:pPr>
         <w:pStyle w:val="Heading2"/>
@@ -14806,7 +14732,7 @@
         <w:t xml:space="preserve">Discussion</w:t>
       </w:r>
     </w:p>
-    <w:bookmarkStart w:id="51" w:name="what-the-validation-shows"/>
+    <w:bookmarkStart w:id="48" w:name="what-the-validation-shows"/>
     <w:p>
       <w:pPr>
         <w:pStyle w:val="Heading3"/>
@@ -14943,8 +14869,8 @@
         <w:t xml:space="preserve">landing exactly on the target. Fourth, the simulator's mode-seeking and coverage-classifier AUROC are bounded by the simulator's inherent template inventory, not by the loop; we report these as negative findings.</w:t>
       </w:r>
     </w:p>
-    <w:bookmarkEnd w:id="51"/>
-    <w:bookmarkStart w:id="52" w:name="what-the-validation-does-not-show"/>
+    <w:bookmarkEnd w:id="48"/>
+    <w:bookmarkStart w:id="49" w:name="what-the-validation-does-not-show"/>
     <w:p>
       <w:pPr>
         <w:pStyle w:val="Heading3"/>
@@ -14971,8 +14897,8 @@
         <w:t xml:space="preserve">We do not claim AttrForge dominates baselines on downstream macro F1: on this task (5 classes, 10 held-out examples, single seed split) all iterated conditions saturate at the same F1, which we attribute to the noise floor of a 10-item test set rather than to the loop. We also do not claim that the simulator's behavior generalizes to live LLM behavior: a live-LLM run with multi-seed reporting on a larger held-out test is the natural next step, and the harness is built to enable it with a one-line backend change.</w:t>
       </w:r>
     </w:p>
-    <w:bookmarkEnd w:id="52"/>
-    <w:bookmarkStart w:id="53" w:name="why-named-complaints-beat-scalar-rewards"/>
+    <w:bookmarkEnd w:id="49"/>
+    <w:bookmarkStart w:id="50" w:name="why-named-complaints-beat-scalar-rewards"/>
     <w:p>
       <w:pPr>
         <w:pStyle w:val="Heading3"/>
@@ -15026,8 +14952,8 @@
         <w:t xml:space="preserve">produces nothing actionable), and (ii) joint constraint satisfaction (the updater is forced to find a rewrite addressing multiple critics; a single scalar invites mode chasing toward the loudest one).</w:t>
       </w:r>
     </w:p>
-    <w:bookmarkEnd w:id="53"/>
-    <w:bookmarkStart w:id="54" w:name="Xd0e86175d0a06b9e9b999ce0770855e041ba1e2"/>
+    <w:bookmarkEnd w:id="50"/>
+    <w:bookmarkStart w:id="51" w:name="Xd0e86175d0a06b9e9b999ce0770855e041ba1e2"/>
     <w:p>
       <w:pPr>
         <w:pStyle w:val="Heading3"/>
@@ -15068,8 +14994,8 @@
         <w:t xml:space="preserve">times even if each individual emission scored perfectly on the standard discriminator. Mode-Seeking similarly catches the joint failure mode where attribute changes produce no surface change.</w:t>
       </w:r>
     </w:p>
-    <w:bookmarkEnd w:id="54"/>
-    <w:bookmarkStart w:id="55" w:name="memory-the-immune-system-analogy"/>
+    <w:bookmarkEnd w:id="51"/>
+    <w:bookmarkStart w:id="52" w:name="memory-the-immune-system-analogy"/>
     <w:p>
       <w:pPr>
         <w:pStyle w:val="Heading3"/>
@@ -15125,8 +15051,8 @@
         <w:t xml:space="preserve">failure state instead.</w:t>
       </w:r>
     </w:p>
-    <w:bookmarkEnd w:id="55"/>
-    <w:bookmarkStart w:id="56" w:name="X693ebf1c1ca8c4365665c93d1ec4747731832e8"/>
+    <w:bookmarkEnd w:id="52"/>
+    <w:bookmarkStart w:id="53" w:name="X693ebf1c1ca8c4365665c93d1ec4747731832e8"/>
     <w:p>
       <w:pPr>
         <w:pStyle w:val="Heading3"/>
@@ -15207,9 +15133,9 @@
         <w:t xml:space="preserve">is the closest existing GAN-style framework for LLM data, pairing one attacker LLM and one defender LLM under a tool-augmented judge. Our setup has seven critics rather than two roles, and our four adversaries are structural transfers of specific GAN defenses (PacGAN, MSGAN, ban-list training, density ratio) rather than free-form roles, so the contributions are complementary: NanoFlux generates adversarial training examples, while we attack mode collapse during the prompt-debugging step. Concurrent preprint work characterizes a related failure mode of multi-objective text-gradient methods (specificity loss with multiple critics); we discuss the empirical anchor for our named-complaint design once the preprint is stable.</w:t>
       </w:r>
     </w:p>
-    <w:bookmarkEnd w:id="56"/>
-    <w:bookmarkEnd w:id="57"/>
-    <w:bookmarkStart w:id="58" w:name="sec-limitations"/>
+    <w:bookmarkEnd w:id="53"/>
+    <w:bookmarkEnd w:id="54"/>
+    <w:bookmarkStart w:id="55" w:name="sec-limitations"/>
     <w:p>
       <w:pPr>
         <w:pStyle w:val="Heading2"/>
@@ -15605,8 +15531,8 @@
         <w:t xml:space="preserve">The 280-word budget is rendered as an instruction in the user message but not enforced programmatically by the simulator updater; it falls back to a soft 8-clause cap with deduplication. A live LLM with instruction-following will respect the word budget more reliably.</w:t>
       </w:r>
     </w:p>
-    <w:bookmarkEnd w:id="58"/>
-    <w:bookmarkStart w:id="59" w:name="sec-conclusion"/>
+    <w:bookmarkEnd w:id="55"/>
+    <w:bookmarkStart w:id="57" w:name="sec-conclusion"/>
     <w:p>
       <w:pPr>
         <w:pStyle w:val="Heading2"/>
@@ -15644,7 +15570,7 @@
       <w:r>
         <w:t xml:space="preserve">The architecture is open-source under MIT (</w:t>
       </w:r>
-      <w:hyperlink r:id="rId10">
+      <w:hyperlink r:id="rId56">
         <w:r>
           <w:rPr>
             <w:rStyle w:val="Hyperlink"/>
@@ -15656,8 +15582,8 @@
         <w:t xml:space="preserve">). Reproducing every result is one Bash invocation plus a backend flag.</w:t>
       </w:r>
     </w:p>
-    <w:bookmarkEnd w:id="59"/>
-    <w:bookmarkStart w:id="132" w:name="sec-references"/>
+    <w:bookmarkEnd w:id="57"/>
+    <w:bookmarkStart w:id="130" w:name="sec-references"/>
     <w:p>
       <w:pPr>
         <w:pStyle w:val="Heading2"/>
@@ -15684,7 +15610,7 @@
         <w:keepLines w:val="0"/>
         <w:widowControl w:val="1"/>
       </w:pPr>
-      <w:bookmarkStart w:id="61" w:name="ref-pacgan"/>
+      <w:bookmarkStart w:id="59" w:name="ref-pacgan"/>
       <w:r>
         <w:t xml:space="preserve">Lin, Z., Khetan, A., Fanti, G., &amp; Oh, S.</w:t>
       </w:r>
@@ -15707,7 +15633,7 @@
       <w:r>
         <w:t xml:space="preserve"> </w:t>
       </w:r>
-      <w:hyperlink r:id="rId60">
+      <w:hyperlink r:id="rId58">
         <w:r>
           <w:rPr>
             <w:rStyle w:val="Hyperlink"/>
@@ -15715,7 +15641,7 @@
           <w:t xml:space="preserve">[NeurIPS]</w:t>
         </w:r>
       </w:hyperlink>
-      <w:bookmarkEnd w:id="61"/>
+      <w:bookmarkEnd w:id="59"/>
     </w:p>
     <w:p>
       <w:pPr>
@@ -15729,7 +15655,7 @@
         <w:keepLines w:val="0"/>
         <w:widowControl w:val="1"/>
       </w:pPr>
-      <w:bookmarkStart w:id="63" w:name="ref-salimans"/>
+      <w:bookmarkStart w:id="61" w:name="ref-salimans"/>
       <w:r>
         <w:t xml:space="preserve">Salimans, T., Goodfellow, I., Zaremba, W., Cheung, V., Radford, A., &amp; Chen, X.</w:t>
       </w:r>
@@ -15752,7 +15678,7 @@
       <w:r>
         <w:t xml:space="preserve"> </w:t>
       </w:r>
-      <w:hyperlink r:id="rId62">
+      <w:hyperlink r:id="rId60">
         <w:r>
           <w:rPr>
             <w:rStyle w:val="Hyperlink"/>
@@ -15760,7 +15686,7 @@
           <w:t xml:space="preserve">[arXiv:1606.03498]</w:t>
         </w:r>
       </w:hyperlink>
-      <w:bookmarkEnd w:id="63"/>
+      <w:bookmarkEnd w:id="61"/>
     </w:p>
     <w:p>
       <w:pPr>
@@ -15774,7 +15700,7 @@
         <w:keepLines w:val="0"/>
         <w:widowControl w:val="1"/>
       </w:pPr>
-      <w:bookmarkStart w:id="65" w:name="ref-msgan"/>
+      <w:bookmarkStart w:id="63" w:name="ref-msgan"/>
       <w:r>
         <w:t xml:space="preserve">Mao, Q., Lee, H.-Y., Tseng, H.-Y., Ma, S., &amp; Yang, M.-H.</w:t>
       </w:r>
@@ -15797,7 +15723,7 @@
       <w:r>
         <w:t xml:space="preserve"> </w:t>
       </w:r>
-      <w:hyperlink r:id="rId64">
+      <w:hyperlink r:id="rId62">
         <w:r>
           <w:rPr>
             <w:rStyle w:val="Hyperlink"/>
@@ -15805,7 +15731,7 @@
           <w:t xml:space="preserve">[CVF]</w:t>
         </w:r>
       </w:hyperlink>
-      <w:bookmarkEnd w:id="65"/>
+      <w:bookmarkEnd w:id="63"/>
     </w:p>
     <w:p>
       <w:pPr>
@@ -15819,7 +15745,7 @@
         <w:keepLines w:val="0"/>
         <w:widowControl w:val="1"/>
       </w:pPr>
-      <w:bookmarkStart w:id="67" w:name="ref-honovich"/>
+      <w:bookmarkStart w:id="65" w:name="ref-honovich"/>
       <w:r>
         <w:t xml:space="preserve">Honovich, O., Scialom, T., Levy, O., &amp; Schick, T.</w:t>
       </w:r>
@@ -15832,6 +15758,51 @@
           <w:iCs/>
         </w:rPr>
         <w:t xml:space="preserve">Unnatural instructions: Tuning language models with (almost) no human labor.</w:t>
+      </w:r>
+      <w:r>
+        <w:t xml:space="preserve"> </w:t>
+      </w:r>
+      <w:r>
+        <w:t xml:space="preserve">ACL, 2023.</w:t>
+      </w:r>
+      <w:r>
+        <w:t xml:space="preserve"> </w:t>
+      </w:r>
+      <w:hyperlink r:id="rId64">
+        <w:r>
+          <w:rPr>
+            <w:rStyle w:val="Hyperlink"/>
+          </w:rPr>
+          <w:t xml:space="preserve">[ACL Anthology]</w:t>
+        </w:r>
+      </w:hyperlink>
+      <w:bookmarkEnd w:id="65"/>
+    </w:p>
+    <w:p>
+      <w:pPr>
+        <w:pStyle w:val="Compact"/>
+        <w:numPr>
+          <w:ilvl w:val="0"/>
+          <w:numId w:val="1006"/>
+        </w:numPr>
+        <w:jc w:val="both"/>
+        <w:keepNext w:val="0"/>
+        <w:keepLines w:val="0"/>
+        <w:widowControl w:val="1"/>
+      </w:pPr>
+      <w:bookmarkStart w:id="67" w:name="ref-self-instruct"/>
+      <w:r>
+        <w:t xml:space="preserve">Wang, Y., Kordi, Y., Mishra, S., Liu, A., Smith, N. A., Khashabi, D., &amp; Hajishirzi, H.</w:t>
+      </w:r>
+      <w:r>
+        <w:t xml:space="preserve"> </w:t>
+      </w:r>
+      <w:r>
+        <w:rPr>
+          <w:i/>
+          <w:iCs/>
+        </w:rPr>
+        <w:t xml:space="preserve">Self-Instruct: Aligning language models with self-generated instructions.</w:t>
       </w:r>
       <w:r>
         <w:t xml:space="preserve"> </w:t>
@@ -15864,9 +15835,9 @@
         <w:keepLines w:val="0"/>
         <w:widowControl w:val="1"/>
       </w:pPr>
-      <w:bookmarkStart w:id="69" w:name="ref-self-instruct"/>
-      <w:r>
-        <w:t xml:space="preserve">Wang, Y., Kordi, Y., Mishra, S., Liu, A., Smith, N. A., Khashabi, D., &amp; Hajishirzi, H.</w:t>
+      <w:bookmarkStart w:id="69" w:name="ref-judge"/>
+      <w:r>
+        <w:t xml:space="preserve">Zheng, L., Chiang, W.-L., Sheng, Y., Zhuang, S., Wu, Z., Zhuang, Y., et al.</w:t>
       </w:r>
       <w:r>
         <w:t xml:space="preserve"> </w:t>
@@ -15876,13 +15847,13 @@
           <w:i/>
           <w:iCs/>
         </w:rPr>
-        <w:t xml:space="preserve">Self-Instruct: Aligning language models with self-generated instructions.</w:t>
-      </w:r>
-      <w:r>
-        <w:t xml:space="preserve"> </w:t>
-      </w:r>
-      <w:r>
-        <w:t xml:space="preserve">ACL, 2023.</w:t>
+        <w:t xml:space="preserve">Judging LLM-as-a-Judge with MT-Bench and Chatbot Arena.</w:t>
+      </w:r>
+      <w:r>
+        <w:t xml:space="preserve"> </w:t>
+      </w:r>
+      <w:r>
+        <w:t xml:space="preserve">NeurIPS, 2023.</w:t>
       </w:r>
       <w:r>
         <w:t xml:space="preserve"> </w:t>
@@ -15892,7 +15863,7 @@
           <w:rPr>
             <w:rStyle w:val="Hyperlink"/>
           </w:rPr>
-          <w:t xml:space="preserve">[ACL Anthology]</w:t>
+          <w:t xml:space="preserve">[OpenReview]</w:t>
         </w:r>
       </w:hyperlink>
       <w:bookmarkEnd w:id="69"/>
@@ -15909,9 +15880,9 @@
         <w:keepLines w:val="0"/>
         <w:widowControl w:val="1"/>
       </w:pPr>
-      <w:bookmarkStart w:id="71" w:name="ref-judge"/>
-      <w:r>
-        <w:t xml:space="preserve">Zheng, L., Chiang, W.-L., Sheng, Y., Zhuang, S., Wu, Z., Zhuang, Y., et al.</w:t>
+      <w:bookmarkStart w:id="71" w:name="ref-unrolled"/>
+      <w:r>
+        <w:t xml:space="preserve">Metz, L., Poole, B., Pfau, D., &amp; Sohl-Dickstein, J.</w:t>
       </w:r>
       <w:r>
         <w:t xml:space="preserve"> </w:t>
@@ -15921,13 +15892,13 @@
           <w:i/>
           <w:iCs/>
         </w:rPr>
-        <w:t xml:space="preserve">Judging LLM-as-a-Judge with MT-Bench and Chatbot Arena.</w:t>
-      </w:r>
-      <w:r>
-        <w:t xml:space="preserve"> </w:t>
-      </w:r>
-      <w:r>
-        <w:t xml:space="preserve">NeurIPS, 2023.</w:t>
+        <w:t xml:space="preserve">Unrolled generative adversarial networks.</w:t>
+      </w:r>
+      <w:r>
+        <w:t xml:space="preserve"> </w:t>
+      </w:r>
+      <w:r>
+        <w:t xml:space="preserve">ICLR, 2017.</w:t>
       </w:r>
       <w:r>
         <w:t xml:space="preserve"> </w:t>
@@ -15937,7 +15908,7 @@
           <w:rPr>
             <w:rStyle w:val="Hyperlink"/>
           </w:rPr>
-          <w:t xml:space="preserve">[OpenReview]</w:t>
+          <w:t xml:space="preserve">[arXiv:1611.02163]</w:t>
         </w:r>
       </w:hyperlink>
       <w:bookmarkEnd w:id="71"/>
@@ -15954,9 +15925,9 @@
         <w:keepLines w:val="0"/>
         <w:widowControl w:val="1"/>
       </w:pPr>
-      <w:bookmarkStart w:id="73" w:name="ref-unrolled"/>
-      <w:r>
-        <w:t xml:space="preserve">Metz, L., Poole, B., Pfau, D., &amp; Sohl-Dickstein, J.</w:t>
+      <w:bookmarkStart w:id="73" w:name="ref-wgan"/>
+      <w:r>
+        <w:t xml:space="preserve">Arjovsky, M., Chintala, S., &amp; Bottou, L.</w:t>
       </w:r>
       <w:r>
         <w:t xml:space="preserve"> </w:t>
@@ -15966,13 +15937,13 @@
           <w:i/>
           <w:iCs/>
         </w:rPr>
-        <w:t xml:space="preserve">Unrolled generative adversarial networks.</w:t>
-      </w:r>
-      <w:r>
-        <w:t xml:space="preserve"> </w:t>
-      </w:r>
-      <w:r>
-        <w:t xml:space="preserve">ICLR, 2017.</w:t>
+        <w:t xml:space="preserve">Wasserstein generative adversarial networks.</w:t>
+      </w:r>
+      <w:r>
+        <w:t xml:space="preserve"> </w:t>
+      </w:r>
+      <w:r>
+        <w:t xml:space="preserve">ICML, 2017.</w:t>
       </w:r>
       <w:r>
         <w:t xml:space="preserve"> </w:t>
@@ -15982,7 +15953,7 @@
           <w:rPr>
             <w:rStyle w:val="Hyperlink"/>
           </w:rPr>
-          <w:t xml:space="preserve">[arXiv:1611.02163]</w:t>
+          <w:t xml:space="preserve">[PMLR]</w:t>
         </w:r>
       </w:hyperlink>
       <w:bookmarkEnd w:id="73"/>
@@ -15999,9 +15970,9 @@
         <w:keepLines w:val="0"/>
         <w:widowControl w:val="1"/>
       </w:pPr>
-      <w:bookmarkStart w:id="75" w:name="ref-wgan"/>
-      <w:r>
-        <w:t xml:space="preserve">Arjovsky, M., Chintala, S., &amp; Bottou, L.</w:t>
+      <w:bookmarkStart w:id="75" w:name="ref-densityratio"/>
+      <w:r>
+        <w:t xml:space="preserve">Sugiyama, M., Suzuki, T., &amp; Kanamori, T.</w:t>
       </w:r>
       <w:r>
         <w:t xml:space="preserve"> </w:t>
@@ -16011,13 +15982,13 @@
           <w:i/>
           <w:iCs/>
         </w:rPr>
-        <w:t xml:space="preserve">Wasserstein generative adversarial networks.</w:t>
-      </w:r>
-      <w:r>
-        <w:t xml:space="preserve"> </w:t>
-      </w:r>
-      <w:r>
-        <w:t xml:space="preserve">ICML, 2017.</w:t>
+        <w:t xml:space="preserve">Density Ratio Estimation in Machine Learning.</w:t>
+      </w:r>
+      <w:r>
+        <w:t xml:space="preserve"> </w:t>
+      </w:r>
+      <w:r>
+        <w:t xml:space="preserve">Cambridge University Press, 2012.</w:t>
       </w:r>
       <w:r>
         <w:t xml:space="preserve"> </w:t>
@@ -16027,7 +15998,7 @@
           <w:rPr>
             <w:rStyle w:val="Hyperlink"/>
           </w:rPr>
-          <w:t xml:space="preserve">[PMLR]</w:t>
+          <w:t xml:space="preserve">[CUP]</w:t>
         </w:r>
       </w:hyperlink>
       <w:bookmarkEnd w:id="75"/>
@@ -16044,9 +16015,9 @@
         <w:keepLines w:val="0"/>
         <w:widowControl w:val="1"/>
       </w:pPr>
-      <w:bookmarkStart w:id="77" w:name="ref-densityratio"/>
-      <w:r>
-        <w:t xml:space="preserve">Sugiyama, M., Suzuki, T., &amp; Kanamori, T.</w:t>
+      <w:bookmarkStart w:id="77" w:name="ref-inpars"/>
+      <w:r>
+        <w:t xml:space="preserve">Bonifacio, L., Abonizio, H., Fadaee, M., &amp; Nogueira, R.</w:t>
       </w:r>
       <w:r>
         <w:t xml:space="preserve"> </w:t>
@@ -16056,13 +16027,13 @@
           <w:i/>
           <w:iCs/>
         </w:rPr>
-        <w:t xml:space="preserve">Density Ratio Estimation in Machine Learning.</w:t>
-      </w:r>
-      <w:r>
-        <w:t xml:space="preserve"> </w:t>
-      </w:r>
-      <w:r>
-        <w:t xml:space="preserve">Cambridge University Press, 2012.</w:t>
+        <w:t xml:space="preserve">InPars: Unsupervised dataset generation for information retrieval.</w:t>
+      </w:r>
+      <w:r>
+        <w:t xml:space="preserve"> </w:t>
+      </w:r>
+      <w:r>
+        <w:t xml:space="preserve">SIGIR, 2022.</w:t>
       </w:r>
       <w:r>
         <w:t xml:space="preserve"> </w:t>
@@ -16072,7 +16043,7 @@
           <w:rPr>
             <w:rStyle w:val="Hyperlink"/>
           </w:rPr>
-          <w:t xml:space="preserve">[CUP]</w:t>
+          <w:t xml:space="preserve">[ACM]</w:t>
         </w:r>
       </w:hyperlink>
       <w:bookmarkEnd w:id="77"/>
@@ -16089,9 +16060,9 @@
         <w:keepLines w:val="0"/>
         <w:widowControl w:val="1"/>
       </w:pPr>
-      <w:bookmarkStart w:id="79" w:name="ref-inpars"/>
-      <w:r>
-        <w:t xml:space="preserve">Bonifacio, L., Abonizio, H., Fadaee, M., &amp; Nogueira, R.</w:t>
+      <w:bookmarkStart w:id="79" w:name="ref-supergen"/>
+      <w:r>
+        <w:t xml:space="preserve">Meng, Y., Huang, J., Zhang, Y., &amp; Han, J.</w:t>
       </w:r>
       <w:r>
         <w:t xml:space="preserve"> </w:t>
@@ -16101,13 +16072,13 @@
           <w:i/>
           <w:iCs/>
         </w:rPr>
-        <w:t xml:space="preserve">InPars: Unsupervised dataset generation for information retrieval.</w:t>
-      </w:r>
-      <w:r>
-        <w:t xml:space="preserve"> </w:t>
-      </w:r>
-      <w:r>
-        <w:t xml:space="preserve">SIGIR, 2022.</w:t>
+        <w:t xml:space="preserve">Generating training data with language models: Towards zero-shot language understanding.</w:t>
+      </w:r>
+      <w:r>
+        <w:t xml:space="preserve"> </w:t>
+      </w:r>
+      <w:r>
+        <w:t xml:space="preserve">NeurIPS, 2022.</w:t>
       </w:r>
       <w:r>
         <w:t xml:space="preserve"> </w:t>
@@ -16117,7 +16088,7 @@
           <w:rPr>
             <w:rStyle w:val="Hyperlink"/>
           </w:rPr>
-          <w:t xml:space="preserve">[ACM]</w:t>
+          <w:t xml:space="preserve">[NeurIPS]</w:t>
         </w:r>
       </w:hyperlink>
       <w:bookmarkEnd w:id="79"/>
@@ -16134,9 +16105,9 @@
         <w:keepLines w:val="0"/>
         <w:widowControl w:val="1"/>
       </w:pPr>
-      <w:bookmarkStart w:id="81" w:name="ref-supergen"/>
-      <w:r>
-        <w:t xml:space="preserve">Meng, Y., Huang, J., Zhang, Y., &amp; Han, J.</w:t>
+      <w:bookmarkStart w:id="81" w:name="ref-progen"/>
+      <w:r>
+        <w:t xml:space="preserve">Ye, J., Gao, J., Wu, Z., Feng, J., Yu, T., &amp; Kong, L.</w:t>
       </w:r>
       <w:r>
         <w:t xml:space="preserve"> </w:t>
@@ -16146,13 +16117,13 @@
           <w:i/>
           <w:iCs/>
         </w:rPr>
-        <w:t xml:space="preserve">Generating training data with language models: Towards zero-shot language understanding.</w:t>
-      </w:r>
-      <w:r>
-        <w:t xml:space="preserve"> </w:t>
-      </w:r>
-      <w:r>
-        <w:t xml:space="preserve">NeurIPS, 2022.</w:t>
+        <w:t xml:space="preserve">ProGen: Progressive zero-shot dataset generation via in-context feedback.</w:t>
+      </w:r>
+      <w:r>
+        <w:t xml:space="preserve"> </w:t>
+      </w:r>
+      <w:r>
+        <w:t xml:space="preserve">Findings of EMNLP, 2022.</w:t>
       </w:r>
       <w:r>
         <w:t xml:space="preserve"> </w:t>
@@ -16162,7 +16133,7 @@
           <w:rPr>
             <w:rStyle w:val="Hyperlink"/>
           </w:rPr>
-          <w:t xml:space="preserve">[NeurIPS]</w:t>
+          <w:t xml:space="preserve">[ACL Anthology]</w:t>
         </w:r>
       </w:hyperlink>
       <w:bookmarkEnd w:id="81"/>
@@ -16179,9 +16150,9 @@
         <w:keepLines w:val="0"/>
         <w:widowControl w:val="1"/>
       </w:pPr>
-      <w:bookmarkStart w:id="83" w:name="ref-progen"/>
-      <w:r>
-        <w:t xml:space="preserve">Ye, J., Gao, J., Wu, Z., Feng, J., Yu, T., &amp; Kong, L.</w:t>
+      <w:bookmarkStart w:id="83" w:name="ref-westsymbolic"/>
+      <w:r>
+        <w:t xml:space="preserve">West, P., Bhagavatula, C., Hessel, J., Hwang, J. D., Jiang, L., Le Bras, R., et al.</w:t>
       </w:r>
       <w:r>
         <w:t xml:space="preserve"> </w:t>
@@ -16191,13 +16162,13 @@
           <w:i/>
           <w:iCs/>
         </w:rPr>
-        <w:t xml:space="preserve">ProGen: Progressive zero-shot dataset generation via in-context feedback.</w:t>
-      </w:r>
-      <w:r>
-        <w:t xml:space="preserve"> </w:t>
-      </w:r>
-      <w:r>
-        <w:t xml:space="preserve">Findings of EMNLP, 2022.</w:t>
+        <w:t xml:space="preserve">Symbolic knowledge distillation: From general language models to commonsense models.</w:t>
+      </w:r>
+      <w:r>
+        <w:t xml:space="preserve"> </w:t>
+      </w:r>
+      <w:r>
+        <w:t xml:space="preserve">NAACL, 2022.</w:t>
       </w:r>
       <w:r>
         <w:t xml:space="preserve"> </w:t>
@@ -16224,9 +16195,9 @@
         <w:keepLines w:val="0"/>
         <w:widowControl w:val="1"/>
       </w:pPr>
-      <w:bookmarkStart w:id="85" w:name="ref-westsymbolic"/>
-      <w:r>
-        <w:t xml:space="preserve">West, P., Bhagavatula, C., Hessel, J., Hwang, J. D., Jiang, L., Le Bras, R., et al.</w:t>
+      <w:bookmarkStart w:id="85" w:name="ref-ape"/>
+      <w:r>
+        <w:t xml:space="preserve">Zhou, Y., Muresanu, A. I., Han, Z., Paster, K., Pitis, S., Chan, H., &amp; Ba, J.</w:t>
       </w:r>
       <w:r>
         <w:t xml:space="preserve"> </w:t>
@@ -16236,13 +16207,13 @@
           <w:i/>
           <w:iCs/>
         </w:rPr>
-        <w:t xml:space="preserve">Symbolic knowledge distillation: From general language models to commonsense models.</w:t>
-      </w:r>
-      <w:r>
-        <w:t xml:space="preserve"> </w:t>
-      </w:r>
-      <w:r>
-        <w:t xml:space="preserve">NAACL, 2022.</w:t>
+        <w:t xml:space="preserve">Large language models are human-level prompt engineers.</w:t>
+      </w:r>
+      <w:r>
+        <w:t xml:space="preserve"> </w:t>
+      </w:r>
+      <w:r>
+        <w:t xml:space="preserve">ICLR, 2023.</w:t>
       </w:r>
       <w:r>
         <w:t xml:space="preserve"> </w:t>
@@ -16252,7 +16223,7 @@
           <w:rPr>
             <w:rStyle w:val="Hyperlink"/>
           </w:rPr>
-          <w:t xml:space="preserve">[ACL Anthology]</w:t>
+          <w:t xml:space="preserve">[arXiv:2211.01910]</w:t>
         </w:r>
       </w:hyperlink>
       <w:bookmarkEnd w:id="85"/>
@@ -16269,9 +16240,9 @@
         <w:keepLines w:val="0"/>
         <w:widowControl w:val="1"/>
       </w:pPr>
-      <w:bookmarkStart w:id="87" w:name="ref-ape"/>
-      <w:r>
-        <w:t xml:space="preserve">Zhou, Y., Muresanu, A. I., Han, Z., Paster, K., Pitis, S., Chan, H., &amp; Ba, J.</w:t>
+      <w:bookmarkStart w:id="87" w:name="ref-opro"/>
+      <w:r>
+        <w:t xml:space="preserve">Yang, C., Wang, X., Lu, Y., Liu, H., Le, Q. V., Zhou, D., &amp; Chen, X.</w:t>
       </w:r>
       <w:r>
         <w:t xml:space="preserve"> </w:t>
@@ -16281,13 +16252,13 @@
           <w:i/>
           <w:iCs/>
         </w:rPr>
-        <w:t xml:space="preserve">Large language models are human-level prompt engineers.</w:t>
-      </w:r>
-      <w:r>
-        <w:t xml:space="preserve"> </w:t>
-      </w:r>
-      <w:r>
-        <w:t xml:space="preserve">ICLR, 2023.</w:t>
+        <w:t xml:space="preserve">Large language models as optimizers.</w:t>
+      </w:r>
+      <w:r>
+        <w:t xml:space="preserve"> </w:t>
+      </w:r>
+      <w:r>
+        <w:t xml:space="preserve">ICLR, 2024.</w:t>
       </w:r>
       <w:r>
         <w:t xml:space="preserve"> </w:t>
@@ -16297,7 +16268,7 @@
           <w:rPr>
             <w:rStyle w:val="Hyperlink"/>
           </w:rPr>
-          <w:t xml:space="preserve">[arXiv:2211.01910]</w:t>
+          <w:t xml:space="preserve">[OpenReview]</w:t>
         </w:r>
       </w:hyperlink>
       <w:bookmarkEnd w:id="87"/>
@@ -16314,9 +16285,9 @@
         <w:keepLines w:val="0"/>
         <w:widowControl w:val="1"/>
       </w:pPr>
-      <w:bookmarkStart w:id="89" w:name="ref-opro"/>
-      <w:r>
-        <w:t xml:space="preserve">Yang, C., Wang, X., Lu, Y., Liu, H., Le, Q. V., Zhou, D., &amp; Chen, X.</w:t>
+      <w:bookmarkStart w:id="89" w:name="ref-evoprompt"/>
+      <w:r>
+        <w:t xml:space="preserve">Guo, Q., Wang, R., Guo, J., Li, B., Song, K., Tan, X., et al.</w:t>
       </w:r>
       <w:r>
         <w:t xml:space="preserve"> </w:t>
@@ -16326,7 +16297,7 @@
           <w:i/>
           <w:iCs/>
         </w:rPr>
-        <w:t xml:space="preserve">Large language models as optimizers.</w:t>
+        <w:t xml:space="preserve">Connecting large language models with evolutionary algorithms yields powerful prompt optimizers.</w:t>
       </w:r>
       <w:r>
         <w:t xml:space="preserve"> </w:t>
@@ -16359,9 +16330,9 @@
         <w:keepLines w:val="0"/>
         <w:widowControl w:val="1"/>
       </w:pPr>
-      <w:bookmarkStart w:id="91" w:name="ref-evoprompt"/>
-      <w:r>
-        <w:t xml:space="preserve">Guo, Q., Wang, R., Guo, J., Li, B., Song, K., Tan, X., et al.</w:t>
+      <w:bookmarkStart w:id="91" w:name="ref-promptbreeder"/>
+      <w:r>
+        <w:t xml:space="preserve">Fernando, C., Banarse, D., Michalewski, H., Osindero, S., &amp; Rocktäschel, T.</w:t>
       </w:r>
       <w:r>
         <w:t xml:space="preserve"> </w:t>
@@ -16371,13 +16342,13 @@
           <w:i/>
           <w:iCs/>
         </w:rPr>
-        <w:t xml:space="preserve">Connecting large language models with evolutionary algorithms yields powerful prompt optimizers.</w:t>
-      </w:r>
-      <w:r>
-        <w:t xml:space="preserve"> </w:t>
-      </w:r>
-      <w:r>
-        <w:t xml:space="preserve">ICLR, 2024.</w:t>
+        <w:t xml:space="preserve">Promptbreeder: Self-referential self-improvement via prompt evolution.</w:t>
+      </w:r>
+      <w:r>
+        <w:t xml:space="preserve"> </w:t>
+      </w:r>
+      <w:r>
+        <w:t xml:space="preserve">arXiv:2309.16797, 2023.</w:t>
       </w:r>
       <w:r>
         <w:t xml:space="preserve"> </w:t>
@@ -16387,7 +16358,7 @@
           <w:rPr>
             <w:rStyle w:val="Hyperlink"/>
           </w:rPr>
-          <w:t xml:space="preserve">[OpenReview]</w:t>
+          <w:t xml:space="preserve">[arXiv]</w:t>
         </w:r>
       </w:hyperlink>
       <w:bookmarkEnd w:id="91"/>
@@ -16404,9 +16375,9 @@
         <w:keepLines w:val="0"/>
         <w:widowControl w:val="1"/>
       </w:pPr>
-      <w:bookmarkStart w:id="93" w:name="ref-promptbreeder"/>
-      <w:r>
-        <w:t xml:space="preserve">Fernando, C., Banarse, D., Michalewski, H., Osindero, S., &amp; Rocktäschel, T.</w:t>
+      <w:bookmarkStart w:id="93" w:name="ref-dspy"/>
+      <w:r>
+        <w:t xml:space="preserve">Khattab, O., Singhvi, A., Maheshwari, P., Zhang, Z., Santhanam, K., Vardhamanan, S., et al.</w:t>
       </w:r>
       <w:r>
         <w:t xml:space="preserve"> </w:t>
@@ -16416,13 +16387,13 @@
           <w:i/>
           <w:iCs/>
         </w:rPr>
-        <w:t xml:space="preserve">Promptbreeder: Self-referential self-improvement via prompt evolution.</w:t>
-      </w:r>
-      <w:r>
-        <w:t xml:space="preserve"> </w:t>
-      </w:r>
-      <w:r>
-        <w:t xml:space="preserve">arXiv:2309.16797, 2023.</w:t>
+        <w:t xml:space="preserve">DSPy: Compiling declarative language model calls into self-improving pipelines.</w:t>
+      </w:r>
+      <w:r>
+        <w:t xml:space="preserve"> </w:t>
+      </w:r>
+      <w:r>
+        <w:t xml:space="preserve">ICLR, 2024.</w:t>
       </w:r>
       <w:r>
         <w:t xml:space="preserve"> </w:t>
@@ -16432,7 +16403,7 @@
           <w:rPr>
             <w:rStyle w:val="Hyperlink"/>
           </w:rPr>
-          <w:t xml:space="preserve">[arXiv]</w:t>
+          <w:t xml:space="preserve">[OpenReview]</w:t>
         </w:r>
       </w:hyperlink>
       <w:bookmarkEnd w:id="93"/>
@@ -16449,9 +16420,9 @@
         <w:keepLines w:val="0"/>
         <w:widowControl w:val="1"/>
       </w:pPr>
-      <w:bookmarkStart w:id="95" w:name="ref-dspy"/>
-      <w:r>
-        <w:t xml:space="preserve">Khattab, O., Singhvi, A., Maheshwari, P., Zhang, Z., Santhanam, K., Vardhamanan, S., et al.</w:t>
+      <w:bookmarkStart w:id="95" w:name="ref-textgrad"/>
+      <w:r>
+        <w:t xml:space="preserve">Yuksekgonul, M., Bianchi, F., Boen, J., Liu, S., Lu, P., Huang, Z., Guestrin, C., &amp; Zou, J.</w:t>
       </w:r>
       <w:r>
         <w:t xml:space="preserve"> </w:t>
@@ -16461,13 +16432,13 @@
           <w:i/>
           <w:iCs/>
         </w:rPr>
-        <w:t xml:space="preserve">DSPy: Compiling declarative language model calls into self-improving pipelines.</w:t>
-      </w:r>
-      <w:r>
-        <w:t xml:space="preserve"> </w:t>
-      </w:r>
-      <w:r>
-        <w:t xml:space="preserve">ICLR, 2024.</w:t>
+        <w:t xml:space="preserve">TextGrad: Automatic "differentiation" via text.</w:t>
+      </w:r>
+      <w:r>
+        <w:t xml:space="preserve"> </w:t>
+      </w:r>
+      <w:r>
+        <w:t xml:space="preserve">arXiv:2406.07496, 2024.</w:t>
       </w:r>
       <w:r>
         <w:t xml:space="preserve"> </w:t>
@@ -16477,7 +16448,7 @@
           <w:rPr>
             <w:rStyle w:val="Hyperlink"/>
           </w:rPr>
-          <w:t xml:space="preserve">[OpenReview]</w:t>
+          <w:t xml:space="preserve">[arXiv]</w:t>
         </w:r>
       </w:hyperlink>
       <w:bookmarkEnd w:id="95"/>
@@ -16494,9 +16465,9 @@
         <w:keepLines w:val="0"/>
         <w:widowControl w:val="1"/>
       </w:pPr>
-      <w:bookmarkStart w:id="97" w:name="ref-textgrad"/>
-      <w:r>
-        <w:t xml:space="preserve">Yuksekgonul, M., Bianchi, F., Boen, J., Liu, S., Lu, P., Huang, Z., Guestrin, C., &amp; Zou, J.</w:t>
+      <w:bookmarkStart w:id="97" w:name="ref-geval"/>
+      <w:r>
+        <w:t xml:space="preserve">Liu, Y., Iter, D., Xu, Y., Wang, S., Xu, R., &amp; Zhu, C.</w:t>
       </w:r>
       <w:r>
         <w:t xml:space="preserve"> </w:t>
@@ -16506,13 +16477,13 @@
           <w:i/>
           <w:iCs/>
         </w:rPr>
-        <w:t xml:space="preserve">TextGrad: Automatic "differentiation" via text.</w:t>
-      </w:r>
-      <w:r>
-        <w:t xml:space="preserve"> </w:t>
-      </w:r>
-      <w:r>
-        <w:t xml:space="preserve">arXiv:2406.07496, 2024.</w:t>
+        <w:t xml:space="preserve">G-Eval: NLG evaluation using GPT-4 with better human alignment.</w:t>
+      </w:r>
+      <w:r>
+        <w:t xml:space="preserve"> </w:t>
+      </w:r>
+      <w:r>
+        <w:t xml:space="preserve">EMNLP, 2023.</w:t>
       </w:r>
       <w:r>
         <w:t xml:space="preserve"> </w:t>
@@ -16522,7 +16493,7 @@
           <w:rPr>
             <w:rStyle w:val="Hyperlink"/>
           </w:rPr>
-          <w:t xml:space="preserve">[arXiv]</w:t>
+          <w:t xml:space="preserve">[ACL Anthology]</w:t>
         </w:r>
       </w:hyperlink>
       <w:bookmarkEnd w:id="97"/>
@@ -16539,9 +16510,9 @@
         <w:keepLines w:val="0"/>
         <w:widowControl w:val="1"/>
       </w:pPr>
-      <w:bookmarkStart w:id="99" w:name="ref-geval"/>
-      <w:r>
-        <w:t xml:space="preserve">Liu, Y., Iter, D., Xu, Y., Wang, S., Xu, R., &amp; Zhu, C.</w:t>
+      <w:bookmarkStart w:id="99" w:name="ref-selfconsistency"/>
+      <w:r>
+        <w:t xml:space="preserve">Wang, X., Wei, J., Schuurmans, D., Le, Q., Chi, E., Narang, S., Chowdhery, A., &amp; Zhou, D.</w:t>
       </w:r>
       <w:r>
         <w:t xml:space="preserve"> </w:t>
@@ -16551,13 +16522,13 @@
           <w:i/>
           <w:iCs/>
         </w:rPr>
-        <w:t xml:space="preserve">G-Eval: NLG evaluation using GPT-4 with better human alignment.</w:t>
-      </w:r>
-      <w:r>
-        <w:t xml:space="preserve"> </w:t>
-      </w:r>
-      <w:r>
-        <w:t xml:space="preserve">EMNLP, 2023.</w:t>
+        <w:t xml:space="preserve">Self-consistency improves chain of thought reasoning in language models.</w:t>
+      </w:r>
+      <w:r>
+        <w:t xml:space="preserve"> </w:t>
+      </w:r>
+      <w:r>
+        <w:t xml:space="preserve">ICLR, 2023.</w:t>
       </w:r>
       <w:r>
         <w:t xml:space="preserve"> </w:t>
@@ -16567,7 +16538,7 @@
           <w:rPr>
             <w:rStyle w:val="Hyperlink"/>
           </w:rPr>
-          <w:t xml:space="preserve">[ACL Anthology]</w:t>
+          <w:t xml:space="preserve">[OpenReview]</w:t>
         </w:r>
       </w:hyperlink>
       <w:bookmarkEnd w:id="99"/>
@@ -16584,9 +16555,9 @@
         <w:keepLines w:val="0"/>
         <w:widowControl w:val="1"/>
       </w:pPr>
-      <w:bookmarkStart w:id="101" w:name="ref-selfconsistency"/>
-      <w:r>
-        <w:t xml:space="preserve">Wang, X., Wei, J., Schuurmans, D., Le, Q., Chi, E., Narang, S., Chowdhery, A., &amp; Zhou, D.</w:t>
+      <w:bookmarkStart w:id="101" w:name="ref-fid"/>
+      <w:r>
+        <w:t xml:space="preserve">Heusel, M., Ramsauer, H., Unterthiner, T., Nessler, B., &amp; Hochreiter, S.</w:t>
       </w:r>
       <w:r>
         <w:t xml:space="preserve"> </w:t>
@@ -16596,13 +16567,13 @@
           <w:i/>
           <w:iCs/>
         </w:rPr>
-        <w:t xml:space="preserve">Self-consistency improves chain of thought reasoning in language models.</w:t>
-      </w:r>
-      <w:r>
-        <w:t xml:space="preserve"> </w:t>
-      </w:r>
-      <w:r>
-        <w:t xml:space="preserve">ICLR, 2023.</w:t>
+        <w:t xml:space="preserve">GANs trained by a two time-scale update rule converge to a local Nash equilibrium.</w:t>
+      </w:r>
+      <w:r>
+        <w:t xml:space="preserve"> </w:t>
+      </w:r>
+      <w:r>
+        <w:t xml:space="preserve">NeurIPS, 2017.</w:t>
       </w:r>
       <w:r>
         <w:t xml:space="preserve"> </w:t>
@@ -16612,7 +16583,7 @@
           <w:rPr>
             <w:rStyle w:val="Hyperlink"/>
           </w:rPr>
-          <w:t xml:space="preserve">[OpenReview]</w:t>
+          <w:t xml:space="preserve">[NeurIPS]</w:t>
         </w:r>
       </w:hyperlink>
       <w:bookmarkEnd w:id="101"/>
@@ -16629,9 +16600,9 @@
         <w:keepLines w:val="0"/>
         <w:widowControl w:val="1"/>
       </w:pPr>
-      <w:bookmarkStart w:id="103" w:name="ref-fid"/>
-      <w:r>
-        <w:t xml:space="preserve">Heusel, M., Ramsauer, H., Unterthiner, T., Nessler, B., &amp; Hochreiter, S.</w:t>
+      <w:bookmarkStart w:id="103" w:name="ref-sajjadi"/>
+      <w:r>
+        <w:t xml:space="preserve">Sajjadi, M. S. M., Bachem, O., Lucic, M., Bousquet, O., &amp; Gelly, S.</w:t>
       </w:r>
       <w:r>
         <w:t xml:space="preserve"> </w:t>
@@ -16641,13 +16612,13 @@
           <w:i/>
           <w:iCs/>
         </w:rPr>
-        <w:t xml:space="preserve">GANs trained by a two time-scale update rule converge to a local Nash equilibrium.</w:t>
-      </w:r>
-      <w:r>
-        <w:t xml:space="preserve"> </w:t>
-      </w:r>
-      <w:r>
-        <w:t xml:space="preserve">NeurIPS, 2017.</w:t>
+        <w:t xml:space="preserve">Assessing generative models via precision and recall.</w:t>
+      </w:r>
+      <w:r>
+        <w:t xml:space="preserve"> </w:t>
+      </w:r>
+      <w:r>
+        <w:t xml:space="preserve">NeurIPS, 2018.</w:t>
       </w:r>
       <w:r>
         <w:t xml:space="preserve"> </w:t>
@@ -16674,9 +16645,9 @@
         <w:keepLines w:val="0"/>
         <w:widowControl w:val="1"/>
       </w:pPr>
-      <w:bookmarkStart w:id="105" w:name="ref-sajjadi"/>
-      <w:r>
-        <w:t xml:space="preserve">Sajjadi, M. S. M., Bachem, O., Lucic, M., Bousquet, O., &amp; Gelly, S.</w:t>
+      <w:bookmarkStart w:id="105" w:name="ref-naeem"/>
+      <w:r>
+        <w:t xml:space="preserve">Naeem, M. F., Oh, S. J., Uh, Y., Choi, Y., &amp; Yoo, J.</w:t>
       </w:r>
       <w:r>
         <w:t xml:space="preserve"> </w:t>
@@ -16686,13 +16657,13 @@
           <w:i/>
           <w:iCs/>
         </w:rPr>
-        <w:t xml:space="preserve">Assessing generative models via precision and recall.</w:t>
-      </w:r>
-      <w:r>
-        <w:t xml:space="preserve"> </w:t>
-      </w:r>
-      <w:r>
-        <w:t xml:space="preserve">NeurIPS, 2018.</w:t>
+        <w:t xml:space="preserve">Reliable fidelity and diversity metrics for generative models.</w:t>
+      </w:r>
+      <w:r>
+        <w:t xml:space="preserve"> </w:t>
+      </w:r>
+      <w:r>
+        <w:t xml:space="preserve">ICML, 2020.</w:t>
       </w:r>
       <w:r>
         <w:t xml:space="preserve"> </w:t>
@@ -16702,7 +16673,7 @@
           <w:rPr>
             <w:rStyle w:val="Hyperlink"/>
           </w:rPr>
-          <w:t xml:space="preserve">[NeurIPS]</w:t>
+          <w:t xml:space="preserve">[PMLR]</w:t>
         </w:r>
       </w:hyperlink>
       <w:bookmarkEnd w:id="105"/>
@@ -16719,9 +16690,9 @@
         <w:keepLines w:val="0"/>
         <w:widowControl w:val="1"/>
       </w:pPr>
-      <w:bookmarkStart w:id="107" w:name="ref-naeem"/>
-      <w:r>
-        <w:t xml:space="preserve">Naeem, M. F., Oh, S. J., Uh, Y., Choi, Y., &amp; Yoo, J.</w:t>
+      <w:bookmarkStart w:id="107" w:name="ref-gepa"/>
+      <w:r>
+        <w:t xml:space="preserve">Agarwal, L., et al.</w:t>
       </w:r>
       <w:r>
         <w:t xml:space="preserve"> </w:t>
@@ -16731,13 +16702,13 @@
           <w:i/>
           <w:iCs/>
         </w:rPr>
-        <w:t xml:space="preserve">Reliable fidelity and diversity metrics for generative models.</w:t>
-      </w:r>
-      <w:r>
-        <w:t xml:space="preserve"> </w:t>
-      </w:r>
-      <w:r>
-        <w:t xml:space="preserve">ICML, 2020.</w:t>
+        <w:t xml:space="preserve">GEPA: Reflective prompt evolution can outperform reinforcement learning.</w:t>
+      </w:r>
+      <w:r>
+        <w:t xml:space="preserve"> </w:t>
+      </w:r>
+      <w:r>
+        <w:t xml:space="preserve">arXiv:2507.19457, 2025.</w:t>
       </w:r>
       <w:r>
         <w:t xml:space="preserve"> </w:t>
@@ -16747,7 +16718,7 @@
           <w:rPr>
             <w:rStyle w:val="Hyperlink"/>
           </w:rPr>
-          <w:t xml:space="preserve">[PMLR]</w:t>
+          <w:t xml:space="preserve">[arXiv]</w:t>
         </w:r>
       </w:hyperlink>
       <w:bookmarkEnd w:id="107"/>
@@ -16764,9 +16735,9 @@
         <w:keepLines w:val="0"/>
         <w:widowControl w:val="1"/>
       </w:pPr>
-      <w:bookmarkStart w:id="109" w:name="ref-gepa"/>
-      <w:r>
-        <w:t xml:space="preserve">Agarwal, L., et al.</w:t>
+      <w:bookmarkStart w:id="109" w:name="ref-paretoprompt"/>
+      <w:r>
+        <w:t xml:space="preserve">Anonymous.</w:t>
       </w:r>
       <w:r>
         <w:t xml:space="preserve"> </w:t>
@@ -16776,13 +16747,13 @@
           <w:i/>
           <w:iCs/>
         </w:rPr>
-        <w:t xml:space="preserve">GEPA: Reflective prompt evolution can outperform reinforcement learning.</w:t>
-      </w:r>
-      <w:r>
-        <w:t xml:space="preserve"> </w:t>
-      </w:r>
-      <w:r>
-        <w:t xml:space="preserve">arXiv:2507.19457, 2025.</w:t>
+        <w:t xml:space="preserve">Pareto prompt optimization.</w:t>
+      </w:r>
+      <w:r>
+        <w:t xml:space="preserve"> </w:t>
+      </w:r>
+      <w:r>
+        <w:t xml:space="preserve">ICLR, 2025.</w:t>
       </w:r>
       <w:r>
         <w:t xml:space="preserve"> </w:t>
@@ -16792,7 +16763,7 @@
           <w:rPr>
             <w:rStyle w:val="Hyperlink"/>
           </w:rPr>
-          <w:t xml:space="preserve">[arXiv]</w:t>
+          <w:t xml:space="preserve">[OpenReview]</w:t>
         </w:r>
       </w:hyperlink>
       <w:bookmarkEnd w:id="109"/>
@@ -16809,9 +16780,9 @@
         <w:keepLines w:val="0"/>
         <w:widowControl w:val="1"/>
       </w:pPr>
-      <w:bookmarkStart w:id="111" w:name="ref-paretoprompt"/>
-      <w:r>
-        <w:t xml:space="preserve">Anonymous.</w:t>
+      <w:bookmarkStart w:id="111" w:name="ref-autopromptens"/>
+      <w:r>
+        <w:t xml:space="preserve">Li, et al.</w:t>
       </w:r>
       <w:r>
         <w:t xml:space="preserve"> </w:t>
@@ -16821,13 +16792,13 @@
           <w:i/>
           <w:iCs/>
         </w:rPr>
-        <w:t xml:space="preserve">Pareto prompt optimization.</w:t>
-      </w:r>
-      <w:r>
-        <w:t xml:space="preserve"> </w:t>
-      </w:r>
-      <w:r>
-        <w:t xml:space="preserve">ICLR, 2025.</w:t>
+        <w:t xml:space="preserve">Auto-prompt ensemble for LLM judge.</w:t>
+      </w:r>
+      <w:r>
+        <w:t xml:space="preserve"> </w:t>
+      </w:r>
+      <w:r>
+        <w:t xml:space="preserve">arXiv:2510.06538, 2025.</w:t>
       </w:r>
       <w:r>
         <w:t xml:space="preserve"> </w:t>
@@ -16837,7 +16808,7 @@
           <w:rPr>
             <w:rStyle w:val="Hyperlink"/>
           </w:rPr>
-          <w:t xml:space="preserve">[OpenReview]</w:t>
+          <w:t xml:space="preserve">[arXiv]</w:t>
         </w:r>
       </w:hyperlink>
       <w:bookmarkEnd w:id="111"/>
@@ -16854,9 +16825,9 @@
         <w:keepLines w:val="0"/>
         <w:widowControl w:val="1"/>
       </w:pPr>
-      <w:bookmarkStart w:id="113" w:name="ref-autopromptens"/>
-      <w:r>
-        <w:t xml:space="preserve">Li, et al.</w:t>
+      <w:bookmarkStart w:id="113" w:name="ref-debatejudges"/>
+      <w:r>
+        <w:t xml:space="preserve">Hu, et al.</w:t>
       </w:r>
       <w:r>
         <w:t xml:space="preserve"> </w:t>
@@ -16866,13 +16837,13 @@
           <w:i/>
           <w:iCs/>
         </w:rPr>
-        <w:t xml:space="preserve">Auto-prompt ensemble for LLM judge.</w:t>
-      </w:r>
-      <w:r>
-        <w:t xml:space="preserve"> </w:t>
-      </w:r>
-      <w:r>
-        <w:t xml:space="preserve">arXiv:2510.06538, 2025.</w:t>
+        <w:t xml:space="preserve">Multi-agent debate for LLM judges with adaptive stability detection.</w:t>
+      </w:r>
+      <w:r>
+        <w:t xml:space="preserve"> </w:t>
+      </w:r>
+      <w:r>
+        <w:t xml:space="preserve">arXiv:2510.12697, 2025.</w:t>
       </w:r>
       <w:r>
         <w:t xml:space="preserve"> </w:t>
@@ -16899,9 +16870,9 @@
         <w:keepLines w:val="0"/>
         <w:widowControl w:val="1"/>
       </w:pPr>
-      <w:bookmarkStart w:id="115" w:name="ref-debatejudges"/>
-      <w:r>
-        <w:t xml:space="preserve">Hu, et al.</w:t>
+      <w:bookmarkStart w:id="115" w:name="ref-verbsampling"/>
+      <w:r>
+        <w:t xml:space="preserve">Zhang, et al.</w:t>
       </w:r>
       <w:r>
         <w:t xml:space="preserve"> </w:t>
@@ -16911,13 +16882,13 @@
           <w:i/>
           <w:iCs/>
         </w:rPr>
-        <w:t xml:space="preserve">Multi-agent debate for LLM judges with adaptive stability detection.</w:t>
-      </w:r>
-      <w:r>
-        <w:t xml:space="preserve"> </w:t>
-      </w:r>
-      <w:r>
-        <w:t xml:space="preserve">arXiv:2510.12697, 2025.</w:t>
+        <w:t xml:space="preserve">Verbalized sampling: How to mitigate mode collapse and unlock LLM diversity.</w:t>
+      </w:r>
+      <w:r>
+        <w:t xml:space="preserve"> </w:t>
+      </w:r>
+      <w:r>
+        <w:t xml:space="preserve">arXiv:2510.01171, 2025.</w:t>
       </w:r>
       <w:r>
         <w:t xml:space="preserve"> </w:t>
@@ -16944,9 +16915,9 @@
         <w:keepLines w:val="0"/>
         <w:widowControl w:val="1"/>
       </w:pPr>
-      <w:bookmarkStart w:id="117" w:name="ref-verbsampling"/>
-      <w:r>
-        <w:t xml:space="preserve">Zhang, et al.</w:t>
+      <w:bookmarkStart w:id="117" w:name="ref-nanoflux"/>
+      <w:r>
+        <w:t xml:space="preserve">Anonymous.</w:t>
       </w:r>
       <w:r>
         <w:t xml:space="preserve"> </w:t>
@@ -16956,13 +16927,13 @@
           <w:i/>
           <w:iCs/>
         </w:rPr>
-        <w:t xml:space="preserve">Verbalized sampling: How to mitigate mode collapse and unlock LLM diversity.</w:t>
-      </w:r>
-      <w:r>
-        <w:t xml:space="preserve"> </w:t>
-      </w:r>
-      <w:r>
-        <w:t xml:space="preserve">arXiv:2510.01171, 2025.</w:t>
+        <w:t xml:space="preserve">NanoFlux: Adversarial dual-LLM evaluation and distillation for multi-domain reasoning.</w:t>
+      </w:r>
+      <w:r>
+        <w:t xml:space="preserve"> </w:t>
+      </w:r>
+      <w:r>
+        <w:t xml:space="preserve">arXiv:2509.23252, 2025.</w:t>
       </w:r>
       <w:r>
         <w:t xml:space="preserve"> </w:t>
@@ -16989,7 +16960,7 @@
         <w:keepLines w:val="0"/>
         <w:widowControl w:val="1"/>
       </w:pPr>
-      <w:bookmarkStart w:id="119" w:name="ref-nanoflux"/>
+      <w:bookmarkStart w:id="119" w:name="ref-strongcollapse"/>
       <w:r>
         <w:t xml:space="preserve">Anonymous.</w:t>
       </w:r>
@@ -17001,13 +16972,13 @@
           <w:i/>
           <w:iCs/>
         </w:rPr>
-        <w:t xml:space="preserve">NanoFlux: Adversarial dual-LLM evaluation and distillation for multi-domain reasoning.</w:t>
-      </w:r>
-      <w:r>
-        <w:t xml:space="preserve"> </w:t>
-      </w:r>
-      <w:r>
-        <w:t xml:space="preserve">arXiv:2509.23252, 2025.</w:t>
+        <w:t xml:space="preserve">Strong model collapse.</w:t>
+      </w:r>
+      <w:r>
+        <w:t xml:space="preserve"> </w:t>
+      </w:r>
+      <w:r>
+        <w:t xml:space="preserve">ICLR, 2025.</w:t>
       </w:r>
       <w:r>
         <w:t xml:space="preserve"> </w:t>
@@ -17017,7 +16988,7 @@
           <w:rPr>
             <w:rStyle w:val="Hyperlink"/>
           </w:rPr>
-          <w:t xml:space="preserve">[arXiv]</w:t>
+          <w:t xml:space="preserve">[ICLR 2025]</w:t>
         </w:r>
       </w:hyperlink>
       <w:bookmarkEnd w:id="119"/>
@@ -17034,9 +17005,9 @@
         <w:keepLines w:val="0"/>
         <w:widowControl w:val="1"/>
       </w:pPr>
-      <w:bookmarkStart w:id="121" w:name="ref-strongcollapse"/>
-      <w:r>
-        <w:t xml:space="preserve">Anonymous.</w:t>
+      <w:bookmarkStart w:id="121" w:name="ref-shumalovnote"/>
+      <w:r>
+        <w:t xml:space="preserve">Kazdan, et al.</w:t>
       </w:r>
       <w:r>
         <w:t xml:space="preserve"> </w:t>
@@ -17046,13 +17017,13 @@
           <w:i/>
           <w:iCs/>
         </w:rPr>
-        <w:t xml:space="preserve">Strong model collapse.</w:t>
-      </w:r>
-      <w:r>
-        <w:t xml:space="preserve"> </w:t>
-      </w:r>
-      <w:r>
-        <w:t xml:space="preserve">ICLR, 2025.</w:t>
+        <w:t xml:space="preserve">A note on Shumailov et al. (2024).</w:t>
+      </w:r>
+      <w:r>
+        <w:t xml:space="preserve"> </w:t>
+      </w:r>
+      <w:r>
+        <w:t xml:space="preserve">arXiv:2410.12954, 2024.</w:t>
       </w:r>
       <w:r>
         <w:t xml:space="preserve"> </w:t>
@@ -17062,7 +17033,7 @@
           <w:rPr>
             <w:rStyle w:val="Hyperlink"/>
           </w:rPr>
-          <w:t xml:space="preserve">[ICLR 2025]</w:t>
+          <w:t xml:space="preserve">[arXiv]</w:t>
         </w:r>
       </w:hyperlink>
       <w:bookmarkEnd w:id="121"/>
@@ -17079,9 +17050,9 @@
         <w:keepLines w:val="0"/>
         <w:widowControl w:val="1"/>
       </w:pPr>
-      <w:bookmarkStart w:id="123" w:name="ref-shumalovnote"/>
-      <w:r>
-        <w:t xml:space="preserve">Kazdan, et al.</w:t>
+      <w:bookmarkStart w:id="123" w:name="ref-syntheggs"/>
+      <w:r>
+        <w:t xml:space="preserve">Anonymous.</w:t>
       </w:r>
       <w:r>
         <w:t xml:space="preserve"> </w:t>
@@ -17091,13 +17062,13 @@
           <w:i/>
           <w:iCs/>
         </w:rPr>
-        <w:t xml:space="preserve">A note on Shumailov et al. (2024).</w:t>
-      </w:r>
-      <w:r>
-        <w:t xml:space="preserve"> </w:t>
-      </w:r>
-      <w:r>
-        <w:t xml:space="preserve">arXiv:2410.12954, 2024.</w:t>
+        <w:t xml:space="preserve">Synthetic eggs in many baskets: The impact of synthetic data diversity on LLM fine-tuning.</w:t>
+      </w:r>
+      <w:r>
+        <w:t xml:space="preserve"> </w:t>
+      </w:r>
+      <w:r>
+        <w:t xml:space="preserve">arXiv:2511.01490, 2025 (Findings of ACL 2026).</w:t>
       </w:r>
       <w:r>
         <w:t xml:space="preserve"> </w:t>
@@ -17124,7 +17095,7 @@
         <w:keepLines w:val="0"/>
         <w:widowControl w:val="1"/>
       </w:pPr>
-      <w:bookmarkStart w:id="125" w:name="ref-syntheggs"/>
+      <w:bookmarkStart w:id="125" w:name="ref-mgtfilter"/>
       <w:r>
         <w:t xml:space="preserve">Anonymous.</w:t>
       </w:r>
@@ -17136,13 +17107,13 @@
           <w:i/>
           <w:iCs/>
         </w:rPr>
-        <w:t xml:space="preserve">Synthetic eggs in many baskets: The impact of synthetic data diversity on LLM fine-tuning.</w:t>
-      </w:r>
-      <w:r>
-        <w:t xml:space="preserve"> </w:t>
-      </w:r>
-      <w:r>
-        <w:t xml:space="preserve">arXiv:2511.01490, 2025 (Findings of ACL 2026).</w:t>
+        <w:t xml:space="preserve">Machine-generated text detection prevents language model collapse.</w:t>
+      </w:r>
+      <w:r>
+        <w:t xml:space="preserve"> </w:t>
+      </w:r>
+      <w:r>
+        <w:t xml:space="preserve">arXiv:2502.15654, 2025.</w:t>
       </w:r>
       <w:r>
         <w:t xml:space="preserve"> </w:t>
@@ -17169,7 +17140,7 @@
         <w:keepLines w:val="0"/>
         <w:widowControl w:val="1"/>
       </w:pPr>
-      <w:bookmarkStart w:id="127" w:name="ref-mgtfilter"/>
+      <w:bookmarkStart w:id="127" w:name="ref-improveddre"/>
       <w:r>
         <w:t xml:space="preserve">Anonymous.</w:t>
       </w:r>
@@ -17181,13 +17152,13 @@
           <w:i/>
           <w:iCs/>
         </w:rPr>
-        <w:t xml:space="preserve">Machine-generated text detection prevents language model collapse.</w:t>
-      </w:r>
-      <w:r>
-        <w:t xml:space="preserve"> </w:t>
-      </w:r>
-      <w:r>
-        <w:t xml:space="preserve">arXiv:2502.15654, 2025.</w:t>
+        <w:t xml:space="preserve">Improved density ratio estimation for evaluating synthetic data quality.</w:t>
+      </w:r>
+      <w:r>
+        <w:t xml:space="preserve"> </w:t>
+      </w:r>
+      <w:r>
+        <w:t xml:space="preserve">ICLR 2025 SynthData workshop.</w:t>
       </w:r>
       <w:r>
         <w:t xml:space="preserve"> </w:t>
@@ -17197,7 +17168,7 @@
           <w:rPr>
             <w:rStyle w:val="Hyperlink"/>
           </w:rPr>
-          <w:t xml:space="preserve">[arXiv]</w:t>
+          <w:t xml:space="preserve">[OpenReview]</w:t>
         </w:r>
       </w:hyperlink>
       <w:bookmarkEnd w:id="127"/>
@@ -17214,52 +17185,7 @@
         <w:keepLines w:val="0"/>
         <w:widowControl w:val="1"/>
       </w:pPr>
-      <w:bookmarkStart w:id="129" w:name="ref-improveddre"/>
-      <w:r>
-        <w:t xml:space="preserve">Anonymous.</w:t>
-      </w:r>
-      <w:r>
-        <w:t xml:space="preserve"> </w:t>
-      </w:r>
-      <w:r>
-        <w:rPr>
-          <w:i/>
-          <w:iCs/>
-        </w:rPr>
-        <w:t xml:space="preserve">Improved density ratio estimation for evaluating synthetic data quality.</w:t>
-      </w:r>
-      <w:r>
-        <w:t xml:space="preserve"> </w:t>
-      </w:r>
-      <w:r>
-        <w:t xml:space="preserve">ICLR 2025 SynthData workshop.</w:t>
-      </w:r>
-      <w:r>
-        <w:t xml:space="preserve"> </w:t>
-      </w:r>
-      <w:hyperlink r:id="rId128">
-        <w:r>
-          <w:rPr>
-            <w:rStyle w:val="Hyperlink"/>
-          </w:rPr>
-          <w:t xml:space="preserve">[OpenReview]</w:t>
-        </w:r>
-      </w:hyperlink>
-      <w:bookmarkEnd w:id="129"/>
-    </w:p>
-    <w:p>
-      <w:pPr>
-        <w:pStyle w:val="Compact"/>
-        <w:numPr>
-          <w:ilvl w:val="0"/>
-          <w:numId w:val="1006"/>
-        </w:numPr>
-        <w:jc w:val="both"/>
-        <w:keepNext w:val="0"/>
-        <w:keepLines w:val="0"/>
-        <w:widowControl w:val="1"/>
-      </w:pPr>
-      <w:bookmarkStart w:id="131" w:name="ref-scendi"/>
+      <w:bookmarkStart w:id="129" w:name="ref-scendi"/>
       <w:r>
         <w:t xml:space="preserve">Jandaghi, et al.</w:t>
       </w:r>
@@ -17282,7 +17208,7 @@
       <w:r>
         <w:t xml:space="preserve"> </w:t>
       </w:r>
-      <w:hyperlink r:id="rId130">
+      <w:hyperlink r:id="rId128">
         <w:r>
           <w:rPr>
             <w:rStyle w:val="Hyperlink"/>
@@ -17290,10 +17216,10 @@
           <w:t xml:space="preserve">[arXiv]</w:t>
         </w:r>
       </w:hyperlink>
-      <w:bookmarkEnd w:id="131"/>
+      <w:bookmarkEnd w:id="129"/>
     </w:p>
-    <w:bookmarkEnd w:id="132"/>
-    <w:bookmarkStart w:id="134" w:name="bibtex"/>
+    <w:bookmarkEnd w:id="130"/>
+    <w:bookmarkStart w:id="131" w:name="bibtex"/>
     <w:p>
       <w:pPr>
         <w:pStyle w:val="Heading2"/>
@@ -17386,40 +17312,46 @@
         <w:widowControl w:val="1"/>
       </w:pPr>
       <w:r>
-        <w:t xml:space="preserve">Built with HTML and</w:t>
-      </w:r>
-      <w:r>
-        <w:t xml:space="preserve"> </w:t>
-      </w:r>
-      <w:hyperlink r:id="rId133">
+        <w:t xml:space="preserve">Code:</w:t>
+      </w:r>
+      <w:r>
+        <w:t xml:space="preserve"> </w:t>
+      </w:r>
+      <w:hyperlink r:id="rId56">
         <w:r>
           <w:rPr>
             <w:rStyle w:val="Hyperlink"/>
           </w:rPr>
-          <w:t xml:space="preserve">KaTeX</w:t>
+          <w:t xml:space="preserve">github.com/ApartsinProjects/PromptForge</w:t>
         </w:r>
       </w:hyperlink>
       <w:r>
-        <w:t xml:space="preserve">. Source on</w:t>
-      </w:r>
-      <w:r>
-        <w:t xml:space="preserve"> </w:t>
-      </w:r>
-      <w:hyperlink r:id="rId10">
+        <w:t xml:space="preserve">.</w:t>
+      </w:r>
+      <w:r>
+        <w:t xml:space="preserve"> </w:t>
+      </w:r>
+      <w:r>
+        <w:t xml:space="preserve">Word version:</w:t>
+      </w:r>
+      <w:r>
+        <w:t xml:space="preserve"> </w:t>
+      </w:r>
+      <w:hyperlink r:id="rId9">
         <w:r>
           <w:rPr>
             <w:rStyle w:val="Hyperlink"/>
           </w:rPr>
-          <w:t xml:space="preserve">GitHub</w:t>
+          <w:t xml:space="preserve">attrforge.docx</w:t>
         </w:r>
       </w:hyperlink>
       <w:r>
         <w:t xml:space="preserve">.</w:t>
       </w:r>
     </w:p>
-    <w:bookmarkEnd w:id="134"/>
+    <w:bookmarkEnd w:id="131"/>
     <w:sectPr>
-      <w:footerReference w:type="default" r:id="rId13"/>
+      <w:footerReference w:type="default" r:id="rId10"/>
       <w:pgSz w:h="15840" w:w="12240"/>
       <w:pgMar w:bottom="1440" w:footer="720" w:gutter="0" w:header="720" w:left="1440" w:right="1440" w:top="1440"/>
       <w:cols w:space="720"/>

</xml_diff>

<commit_message>
Paper v0.6.2: honest statistical framing of sentence-transformer comparison
Sanity check on the v0.6 claim that the gap 'reverses' with sentence-transformer
features: it does not. The paired t-test for full_attrforge vs full_classic under
sentence-transformer features gives p=0.66 with 95% bootstrap CI [-0.073, +0.180]
that includes zero (1 of 3 seeds favors full_attrforge, 1 ties, 1 favors
full_classic). The TF-IDF gap is the only statistically directional finding.

Title and abstract now report the honest framing:
- TF-IDF: 7-critic loop scores 0.18 below 3-critic, directional 3/3 seeds, p=0.09, CI excludes 0
- Sentence-transformer: gap statistically indistinguishable from zero (CI includes 0)

The story is 'the cost vanishes', not 'the cost reverses'. Both Section 1 and Section
7.2 updated. Table 2b caption rephrased with both paired tests.

Co-Authored-By: Claude Opus 4.7 (1M context) <noreply@anthropic.com>
</commit_message>
<xml_diff>
--- a/docs/attrforge.docx
+++ b/docs/attrforge.docx
@@ -31,7 +31,7 @@
         </w:r>
       </w:hyperlink>
     </w:p>
-    <w:bookmarkStart w:id="10" w:name="X2de609c4fadd600df4ff82e716e4156b1fe9cd0"/>
+    <w:bookmarkStart w:id="10" w:name="X3c3319ed218187af625634b911eeefc8cbe4094"/>
     <w:p>
       <w:pPr>
         <w:pStyle w:val="Title"/>
@@ -42,7 +42,7 @@
         <w:widowControl w:val="1"/>
       </w:pPr>
       <w:r>
-        <w:t xml:space="preserve">It Depends on the Classifier: GAN-Style Adversaries in LLM Prompt Debugging Reveal a Representation-Dependent Diversity-Utility Tradeoff</w:t>
+        <w:t xml:space="preserve">It Depends on the Classifier: GAN-Style Adversaries in LLM Prompt Debugging Are Penalised by a TF-IDF Reader and Tolerated by a Sentence-Transformer Reader</w:t>
       </w:r>
     </w:p>
     <w:p>
@@ -55,7 +55,7 @@
         <w:widowControl w:val="1"/>
       </w:pPr>
       <w:r>
-        <w:t xml:space="preserve">We adapt four GAN mode-collapse defenses (PacGAN, MSGAN, ban-list, density-ratio coverage) into a multi-critic LLM prompt-debugging loop. The seven-critic loop increases downstream macro F1 over a three-critic baseline (0.71 vs 0.67) when the downstream classifier is a sentence-transformer, but decreases it (0.40 vs 0.58) when the classifier is TF-IDF. We document this representation-dependent tradeoff and the post-hoc adversary audit protocol that makes it measurable.</w:t>
+        <w:t xml:space="preserve">We adapt four GAN mode-collapse defenses (PacGAN, MSGAN, ban-list, density-ratio coverage) into a multi-critic LLM prompt-debugging loop. The seven-critic loop scores 0.18 macro F1 below a three-critic baseline when the downstream classifier is TF-IDF word features (directional 3/3 seeds; 95% bootstrap CI excludes zero; underpowered paired t p=0.09 at N=3). The gap disappears when the downstream classifier is a sentence-transformer (mean diff +0.04; CI [-0.07, 0.18] includes zero; not significant). We document this representation-dependent reading of the diversity-utility tradeoff and the post-hoc adversary audit protocol that makes it measurable.</w:t>
       </w:r>
     </w:p>
     <w:p>
@@ -181,7 +181,7 @@
         <w:widowControl w:val="1"/>
       </w:pPr>
       <w:r>
-        <w:t xml:space="preserve">The diversity vs discriminability tradeoff in LLM-generated synthetic data is widely understood as a single-axis question: more variety, harder to classify. We show that the answer depends on the downstream classifier's representation capacity. We adapt four classical GAN mode-collapse defenses (PacGAN, MSGAN, ban-list training, and density-ratio coverage) into a multi-critic prompt-debugging loop combining them with three baseline LLM critics (attribute verifier, per-sample realism discriminator, diversity auditor), giving us a 3-critic baseline and a 7-critic loop that share the same harness and the same generator (</w:t>
+        <w:t xml:space="preserve">The diversity vs utility tradeoff in LLM-generated synthetic data is widely understood as a single-axis question: more variety, harder to classify. We show that whether that intuition holds depends on the capacity of the downstream classifier used to read the data. We adapt four classical GAN mode-collapse defenses (PacGAN, MSGAN, ban-list training, density-ratio coverage) into a multi-critic prompt-debugging loop combining them with three baseline LLM critics (attribute verifier, per-sample realism discriminator, diversity auditor), giving us a 3-critic baseline and a 7-critic loop that share the same harness and the same generator (</w:t>
       </w:r>
       <w:r>
         <w:rPr>
@@ -202,23 +202,7 @@
         <w:widowControl w:val="1"/>
       </w:pPr>
       <w:r>
-        <w:t xml:space="preserve">Across 3 random seeds on a customer-support intent classification task, the headline tradeoff</w:t>
-      </w:r>
-      <w:r>
-        <w:t xml:space="preserve"> </w:t>
-      </w:r>
-      <w:r>
-        <w:rPr>
-          <w:i/>
-          <w:iCs/>
-        </w:rPr>
-        <w:t xml:space="preserve">flips direction</w:t>
-      </w:r>
-      <w:r>
-        <w:t xml:space="preserve"> </w:t>
-      </w:r>
-      <w:r>
-        <w:t xml:space="preserve">depending on the downstream classifier (Section 7): with a TF-IDF + logistic-regression classifier, the 3-critic loop achieves</w:t>
+        <w:t xml:space="preserve">Across 3 random seeds on a customer-support intent classification task, the gap between the 3-critic and 7-critic loops is mediated by the downstream classifier (Section 7). With TF-IDF word features and logistic regression, the 3-critic loop achieves macro F1</w:t>
       </w:r>
       <w:r>
         <w:t xml:space="preserve"> </w:t>
@@ -234,7 +218,7 @@
         <w:t xml:space="preserve"> </w:t>
       </w:r>
       <w:r>
-        <w:t xml:space="preserve">macro F1 and adding the 4 GAN adversaries drops F1 to</w:t>
+        <w:t xml:space="preserve">on the held-out real test set; adding the 4 GAN-style adversaries drops F1 to</w:t>
       </w:r>
       <w:r>
         <w:t xml:space="preserve"> </w:t>
@@ -247,23 +231,137 @@
         <w:t xml:space="preserve">0.40 ± 0.06</w:t>
       </w:r>
       <w:r>
-        <w:t xml:space="preserve">; with sentence-transformer embeddings as features,</w:t>
-      </w:r>
-      <w:r>
-        <w:t xml:space="preserve"> </w:t>
-      </w:r>
-      <w:r>
-        <w:rPr>
-          <w:b/>
-          <w:bCs/>
-        </w:rPr>
-        <w:t xml:space="preserve">the 7-critic loop achieves the best macro F1 at 0.71 ± 0.08</w:t>
-      </w:r>
-      <w:r>
-        <w:t xml:space="preserve"> </w:t>
-      </w:r>
-      <w:r>
-        <w:t xml:space="preserve">while the 3-critic baseline drops to</w:t>
+        <w:t xml:space="preserve"> </w:t>
+      </w:r>
+      <w:r>
+        <w:t xml:space="preserve">(mean paired diff</w:t>
+      </w:r>
+      <w:r>
+        <w:t xml:space="preserve"> </w:t>
+      </w:r>
+      <m:oMath>
+        <m:r>
+          <m:rPr>
+            <m:sty m:val="p"/>
+          </m:rPr>
+          <m:t>−</m:t>
+        </m:r>
+        <m:r>
+          <m:t>0.187</m:t>
+        </m:r>
+      </m:oMath>
+      <w:r>
+        <w:t xml:space="preserve">, 95% bootstrap CI</w:t>
+      </w:r>
+      <w:r>
+        <w:t xml:space="preserve"> </w:t>
+      </w:r>
+      <m:oMath>
+        <m:r>
+          <m:rPr>
+            <m:sty m:val="p"/>
+          </m:rPr>
+          <m:t>[</m:t>
+        </m:r>
+        <m:r>
+          <m:rPr>
+            <m:sty m:val="p"/>
+          </m:rPr>
+          <m:t>−</m:t>
+        </m:r>
+        <m:r>
+          <m:t>0.267</m:t>
+        </m:r>
+        <m:r>
+          <m:rPr>
+            <m:sty m:val="p"/>
+          </m:rPr>
+          <m:t>,</m:t>
+        </m:r>
+        <m:r>
+          <m:rPr>
+            <m:sty m:val="p"/>
+          </m:rPr>
+          <m:t>−</m:t>
+        </m:r>
+        <m:r>
+          <m:t>0.067</m:t>
+        </m:r>
+        <m:r>
+          <m:rPr>
+            <m:sty m:val="p"/>
+          </m:rPr>
+          <m:t>]</m:t>
+        </m:r>
+      </m:oMath>
+      <w:r>
+        <w:t xml:space="preserve">, conventional paired-t</w:t>
+      </w:r>
+      <w:r>
+        <w:t xml:space="preserve"> </w:t>
+      </w:r>
+      <m:oMath>
+        <m:r>
+          <m:t>p</m:t>
+        </m:r>
+        <m:r>
+          <m:rPr>
+            <m:sty m:val="p"/>
+          </m:rPr>
+          <m:t>=</m:t>
+        </m:r>
+        <m:r>
+          <m:t>0.09</m:t>
+        </m:r>
+      </m:oMath>
+      <w:r>
+        <w:t xml:space="preserve"> </w:t>
+      </w:r>
+      <w:r>
+        <w:t xml:space="preserve">and Wilcoxon</w:t>
+      </w:r>
+      <w:r>
+        <w:t xml:space="preserve"> </w:t>
+      </w:r>
+      <m:oMath>
+        <m:r>
+          <m:t>p</m:t>
+        </m:r>
+        <m:r>
+          <m:rPr>
+            <m:sty m:val="p"/>
+          </m:rPr>
+          <m:t>=</m:t>
+        </m:r>
+        <m:r>
+          <m:t>0.25</m:t>
+        </m:r>
+      </m:oMath>
+      <w:r>
+        <w:t xml:space="preserve"> </w:t>
+      </w:r>
+      <w:r>
+        <w:t xml:space="preserve">at</w:t>
+      </w:r>
+      <w:r>
+        <w:t xml:space="preserve"> </w:t>
+      </w:r>
+      <m:oMath>
+        <m:r>
+          <m:t>N</m:t>
+        </m:r>
+        <m:r>
+          <m:rPr>
+            <m:sty m:val="p"/>
+          </m:rPr>
+          <m:t>=</m:t>
+        </m:r>
+        <m:r>
+          <m:t>3</m:t>
+        </m:r>
+      </m:oMath>
+      <w:r>
+        <w:t xml:space="preserve">). All three seeds show the gap in the same direction. With sentence-transformer embeddings as features, the 3-critic loop scores</w:t>
       </w:r>
       <w:r>
         <w:t xml:space="preserve"> </w:t>
@@ -276,7 +374,124 @@
         <w:t xml:space="preserve">0.67 ± 0.13</w:t>
       </w:r>
       <w:r>
-        <w:t xml:space="preserve">. The gap on TF-IDF is consistent across all 3 seeds (paired diffs +0.23, +0.27, +0.07; 95% bootstrap CI [0.07, 0.27]; paired-t p=0.09, Wilcoxon p=0.25 at N=3). The two results together support our central empirical claim: adversarial prompt-debugging injects surface variation that a low-capacity classifier reads as</w:t>
+        <w:t xml:space="preserve"> </w:t>
+      </w:r>
+      <w:r>
+        <w:t xml:space="preserve">and the 7-critic loop scores</w:t>
+      </w:r>
+      <w:r>
+        <w:t xml:space="preserve"> </w:t>
+      </w:r>
+      <w:r>
+        <w:rPr>
+          <w:b/>
+          <w:bCs/>
+        </w:rPr>
+        <w:t xml:space="preserve">0.71 ± 0.08</w:t>
+      </w:r>
+      <w:r>
+        <w:t xml:space="preserve">; the paired difference (mean</w:t>
+      </w:r>
+      <w:r>
+        <w:t xml:space="preserve"> </w:t>
+      </w:r>
+      <m:oMath>
+        <m:r>
+          <m:rPr>
+            <m:sty m:val="p"/>
+          </m:rPr>
+          <m:t>+</m:t>
+        </m:r>
+        <m:r>
+          <m:t>0.038</m:t>
+        </m:r>
+      </m:oMath>
+      <w:r>
+        <w:t xml:space="preserve">, CI</w:t>
+      </w:r>
+      <w:r>
+        <w:t xml:space="preserve"> </w:t>
+      </w:r>
+      <m:oMath>
+        <m:r>
+          <m:rPr>
+            <m:sty m:val="p"/>
+          </m:rPr>
+          <m:t>[</m:t>
+        </m:r>
+        <m:r>
+          <m:rPr>
+            <m:sty m:val="p"/>
+          </m:rPr>
+          <m:t>−</m:t>
+        </m:r>
+        <m:r>
+          <m:t>0.073</m:t>
+        </m:r>
+        <m:r>
+          <m:rPr>
+            <m:sty m:val="p"/>
+          </m:rPr>
+          <m:t>,</m:t>
+        </m:r>
+        <m:r>
+          <m:rPr>
+            <m:sty m:val="p"/>
+          </m:rPr>
+          <m:t>+</m:t>
+        </m:r>
+        <m:r>
+          <m:t>0.180</m:t>
+        </m:r>
+        <m:r>
+          <m:rPr>
+            <m:sty m:val="p"/>
+          </m:rPr>
+          <m:t>]</m:t>
+        </m:r>
+      </m:oMath>
+      <w:r>
+        <w:t xml:space="preserve">, paired-t</w:t>
+      </w:r>
+      <w:r>
+        <w:t xml:space="preserve"> </w:t>
+      </w:r>
+      <m:oMath>
+        <m:r>
+          <m:t>p</m:t>
+        </m:r>
+        <m:r>
+          <m:rPr>
+            <m:sty m:val="p"/>
+          </m:rPr>
+          <m:t>=</m:t>
+        </m:r>
+        <m:r>
+          <m:t>0.66</m:t>
+        </m:r>
+      </m:oMath>
+      <w:r>
+        <w:t xml:space="preserve">, Wilcoxon</w:t>
+      </w:r>
+      <w:r>
+        <w:t xml:space="preserve"> </w:t>
+      </w:r>
+      <m:oMath>
+        <m:r>
+          <m:t>p</m:t>
+        </m:r>
+        <m:r>
+          <m:rPr>
+            <m:sty m:val="p"/>
+          </m:rPr>
+          <m:t>=</m:t>
+        </m:r>
+        <m:r>
+          <m:t>0.75</m:t>
+        </m:r>
+      </m:oMath>
+      <w:r>
+        <w:t xml:space="preserve">) is statistically indistinguishable from zero. The honest reading is that the 7-critic loop carries a measurable cost under a keyword-driven downstream reader and a cost that disappears under an embedding-based reader:</w:t>
       </w:r>
       <w:r>
         <w:t xml:space="preserve"> </w:t>
@@ -286,29 +501,10 @@
           <w:i/>
           <w:iCs/>
         </w:rPr>
-        <w:t xml:space="preserve">noise</w:t>
-      </w:r>
-      <w:r>
-        <w:t xml:space="preserve"> </w:t>
-      </w:r>
-      <w:r>
-        <w:t xml:space="preserve">destroying keyword consistency, but that a deeper representation reads as</w:t>
-      </w:r>
-      <w:r>
-        <w:t xml:space="preserve"> </w:t>
-      </w:r>
-      <w:r>
-        <w:rPr>
-          <w:i/>
-          <w:iCs/>
-        </w:rPr>
-        <w:t xml:space="preserve">data</w:t>
-      </w:r>
-      <w:r>
-        <w:t xml:space="preserve"> </w:t>
-      </w:r>
-      <w:r>
-        <w:t xml:space="preserve">covering more of the linguistic surface of real customer messages.</w:t>
+        <w:t xml:space="preserve">the disadvantage flips into a tie, not a reversal</w:t>
+      </w:r>
+      <w:r>
+        <w:t xml:space="preserve">.</w:t>
       </w:r>
     </w:p>
     <w:p>
@@ -320,7 +516,7 @@
         <w:widowControl w:val="1"/>
       </w:pPr>
       <w:r>
-        <w:t xml:space="preserve">Beyond this main result we release: (i) the open-source seven-critic harness with a single-flag-per-critic ablation contract; (ii) a</w:t>
+        <w:t xml:space="preserve">Beyond this main result we release: (i) an open-source seven-critic harness with a single-flag-per-critic ablation contract; (ii) a</w:t>
       </w:r>
       <w:r>
         <w:t xml:space="preserve"> </w:t>
@@ -352,7 +548,21 @@
         <w:t xml:space="preserve"> </w:t>
       </w:r>
       <w:r>
-        <w:t xml:space="preserve">from chance under iteration; Coverage Hole Finder AUROC remains at 1.00 for every condition); and (v) per-iteration on-disk manifests sufficient for byte-for-byte reproduction.</w:t>
+        <w:t xml:space="preserve">from chance under iteration; the Coverage Hole Finder's density-ratio classifier remains at AUROC</w:t>
+      </w:r>
+      <w:r>
+        <w:t xml:space="preserve"> </w:t>
+      </w:r>
+      <m:oMath>
+        <m:r>
+          <m:t>1.00</m:t>
+        </m:r>
+      </m:oMath>
+      <w:r>
+        <w:t xml:space="preserve"> </w:t>
+      </w:r>
+      <w:r>
+        <w:t xml:space="preserve">across all conditions); and (v) per-iteration on-disk manifests sufficient for byte-for-byte reproduction.</w:t>
       </w:r>
     </w:p>
     <w:bookmarkEnd w:id="11"/>
@@ -749,20 +959,7 @@
         <w:widowControl w:val="1"/>
       </w:pPr>
       <w:r>
-        <w:t xml:space="preserve">This paper documents that the answer is more subtle:</w:t>
-      </w:r>
-      <w:r>
-        <w:t xml:space="preserve"> </w:t>
-      </w:r>
-      <w:r>
-        <w:rPr>
-          <w:i/>
-          <w:iCs/>
-        </w:rPr>
-        <w:t xml:space="preserve">it depends on what the downstream classifier looks like</w:t>
-      </w:r>
-      <w:r>
-        <w:t xml:space="preserve">. We adapt four classical GAN mode-collapse defenses (PacGAN</w:t>
+        <w:t xml:space="preserve">This paper documents that the answer is mediated by the downstream classifier's representation. We adapt four classical GAN mode-collapse defenses (PacGAN</w:t>
       </w:r>
       <w:r>
         <w:t xml:space="preserve"> </w:t>
@@ -819,7 +1016,7 @@
         <w:t xml:space="preserve"> </w:t>
       </w:r>
       <w:r>
-        <w:t xml:space="preserve">across 3 random seeds, the same synthetic-data batches yield two different rankings depending on the downstream classifier (Section 7.2). With TF-IDF word features and logistic regression, the 3-critic loop achieves</w:t>
+        <w:t xml:space="preserve">across 3 random seeds, the same synthetic-data batches yield different rankings depending on the downstream classifier (Section 7.2). With TF-IDF word features and logistic regression, the 3-critic loop achieves</w:t>
       </w:r>
       <w:r>
         <w:t xml:space="preserve"> </w:t>
@@ -848,7 +1045,114 @@
         <w:t xml:space="preserve">0.40 ± 0.06</w:t>
       </w:r>
       <w:r>
-        <w:t xml:space="preserve">: the GAN adversaries appear to hurt. With sentence-transformer embeddings as features, the 7-critic loop achieves the</w:t>
+        <w:t xml:space="preserve"> </w:t>
+      </w:r>
+      <w:r>
+        <w:t xml:space="preserve">(paired difference</w:t>
+      </w:r>
+      <w:r>
+        <w:t xml:space="preserve"> </w:t>
+      </w:r>
+      <m:oMath>
+        <m:r>
+          <m:rPr>
+            <m:sty m:val="p"/>
+          </m:rPr>
+          <m:t>−</m:t>
+        </m:r>
+        <m:r>
+          <m:t>0.187</m:t>
+        </m:r>
+      </m:oMath>
+      <w:r>
+        <w:t xml:space="preserve">, 95% bootstrap CI</w:t>
+      </w:r>
+      <w:r>
+        <w:t xml:space="preserve"> </w:t>
+      </w:r>
+      <m:oMath>
+        <m:r>
+          <m:rPr>
+            <m:sty m:val="p"/>
+          </m:rPr>
+          <m:t>[</m:t>
+        </m:r>
+        <m:r>
+          <m:rPr>
+            <m:sty m:val="p"/>
+          </m:rPr>
+          <m:t>−</m:t>
+        </m:r>
+        <m:r>
+          <m:t>0.267</m:t>
+        </m:r>
+        <m:r>
+          <m:rPr>
+            <m:sty m:val="p"/>
+          </m:rPr>
+          <m:t>,</m:t>
+        </m:r>
+        <m:r>
+          <m:rPr>
+            <m:sty m:val="p"/>
+          </m:rPr>
+          <m:t>−</m:t>
+        </m:r>
+        <m:r>
+          <m:t>0.067</m:t>
+        </m:r>
+        <m:r>
+          <m:rPr>
+            <m:sty m:val="p"/>
+          </m:rPr>
+          <m:t>]</m:t>
+        </m:r>
+      </m:oMath>
+      <w:r>
+        <w:t xml:space="preserve">, directional across 3/3 seeds, paired-t</w:t>
+      </w:r>
+      <w:r>
+        <w:t xml:space="preserve"> </w:t>
+      </w:r>
+      <m:oMath>
+        <m:r>
+          <m:t>p</m:t>
+        </m:r>
+        <m:r>
+          <m:rPr>
+            <m:sty m:val="p"/>
+          </m:rPr>
+          <m:t>=</m:t>
+        </m:r>
+        <m:r>
+          <m:t>0.09</m:t>
+        </m:r>
+      </m:oMath>
+      <w:r>
+        <w:t xml:space="preserve"> </w:t>
+      </w:r>
+      <w:r>
+        <w:t xml:space="preserve">at</w:t>
+      </w:r>
+      <w:r>
+        <w:t xml:space="preserve"> </w:t>
+      </w:r>
+      <m:oMath>
+        <m:r>
+          <m:t>N</m:t>
+        </m:r>
+        <m:r>
+          <m:rPr>
+            <m:sty m:val="p"/>
+          </m:rPr>
+          <m:t>=</m:t>
+        </m:r>
+        <m:r>
+          <m:t>3</m:t>
+        </m:r>
+      </m:oMath>
+      <w:r>
+        <w:t xml:space="preserve">). With sentence-transformer embeddings as features, the 3-critic loop scores</w:t>
       </w:r>
       <w:r>
         <w:t xml:space="preserve"> </w:t>
@@ -858,13 +1162,13 @@
           <w:b/>
           <w:bCs/>
         </w:rPr>
-        <w:t xml:space="preserve">best</w:t>
-      </w:r>
-      <w:r>
-        <w:t xml:space="preserve"> </w:t>
-      </w:r>
-      <w:r>
-        <w:t xml:space="preserve">macro F1 at</w:t>
+        <w:t xml:space="preserve">0.67 ± 0.13</w:t>
+      </w:r>
+      <w:r>
+        <w:t xml:space="preserve"> </w:t>
+      </w:r>
+      <w:r>
+        <w:t xml:space="preserve">and the 7-critic loop scores</w:t>
       </w:r>
       <w:r>
         <w:t xml:space="preserve"> </w:t>
@@ -877,23 +1181,88 @@
         <w:t xml:space="preserve">0.71 ± 0.08</w:t>
       </w:r>
       <w:r>
-        <w:t xml:space="preserve"> </w:t>
-      </w:r>
-      <w:r>
-        <w:t xml:space="preserve">against the 3-critic baseline's</w:t>
-      </w:r>
-      <w:r>
-        <w:t xml:space="preserve"> </w:t>
-      </w:r>
-      <w:r>
-        <w:rPr>
-          <w:b/>
-          <w:bCs/>
-        </w:rPr>
-        <w:t xml:space="preserve">0.67 ± 0.13</w:t>
-      </w:r>
-      <w:r>
-        <w:t xml:space="preserve">: the GAN adversaries appear to help.</w:t>
+        <w:t xml:space="preserve">, but the paired difference (mean</w:t>
+      </w:r>
+      <w:r>
+        <w:t xml:space="preserve"> </w:t>
+      </w:r>
+      <m:oMath>
+        <m:r>
+          <m:rPr>
+            <m:sty m:val="p"/>
+          </m:rPr>
+          <m:t>+</m:t>
+        </m:r>
+        <m:r>
+          <m:t>0.038</m:t>
+        </m:r>
+      </m:oMath>
+      <w:r>
+        <w:t xml:space="preserve">, CI</w:t>
+      </w:r>
+      <w:r>
+        <w:t xml:space="preserve"> </w:t>
+      </w:r>
+      <m:oMath>
+        <m:r>
+          <m:rPr>
+            <m:sty m:val="p"/>
+          </m:rPr>
+          <m:t>[</m:t>
+        </m:r>
+        <m:r>
+          <m:rPr>
+            <m:sty m:val="p"/>
+          </m:rPr>
+          <m:t>−</m:t>
+        </m:r>
+        <m:r>
+          <m:t>0.073</m:t>
+        </m:r>
+        <m:r>
+          <m:rPr>
+            <m:sty m:val="p"/>
+          </m:rPr>
+          <m:t>,</m:t>
+        </m:r>
+        <m:r>
+          <m:rPr>
+            <m:sty m:val="p"/>
+          </m:rPr>
+          <m:t>+</m:t>
+        </m:r>
+        <m:r>
+          <m:t>0.180</m:t>
+        </m:r>
+        <m:r>
+          <m:rPr>
+            <m:sty m:val="p"/>
+          </m:rPr>
+          <m:t>]</m:t>
+        </m:r>
+      </m:oMath>
+      <w:r>
+        <w:t xml:space="preserve">,</w:t>
+      </w:r>
+      <w:r>
+        <w:t xml:space="preserve"> </w:t>
+      </w:r>
+      <m:oMath>
+        <m:r>
+          <m:t>p</m:t>
+        </m:r>
+        <m:r>
+          <m:rPr>
+            <m:sty m:val="p"/>
+          </m:rPr>
+          <m:t>=</m:t>
+        </m:r>
+        <m:r>
+          <m:t>0.66</m:t>
+        </m:r>
+      </m:oMath>
+      <w:r>
+        <w:t xml:space="preserve">) is statistically indistinguishable from zero. The honest finding is not that the tradeoff</w:t>
       </w:r>
       <w:r>
         <w:t xml:space="preserve"> </w:t>
@@ -903,7 +1272,23 @@
           <w:i/>
           <w:iCs/>
         </w:rPr>
-        <w:t xml:space="preserve">Which "tradeoff" the data shows depends on what reads it.</w:t>
+        <w:t xml:space="preserve">reverses</w:t>
+      </w:r>
+      <w:r>
+        <w:t xml:space="preserve">, but that it</w:t>
+      </w:r>
+      <w:r>
+        <w:t xml:space="preserve"> </w:t>
+      </w:r>
+      <w:r>
+        <w:rPr>
+          <w:i/>
+          <w:iCs/>
+        </w:rPr>
+        <w:t xml:space="preserve">vanishes</w:t>
+      </w:r>
+      <w:r>
+        <w:t xml:space="preserve">: the cost is real under a low-capacity reader and not detectable under a stronger one.</w:t>
       </w:r>
     </w:p>
     <w:p>
@@ -915,7 +1300,7 @@
         <w:widowControl w:val="1"/>
       </w:pPr>
       <w:r>
-        <w:t xml:space="preserve">The mechanism we identify is a</w:t>
+        <w:t xml:space="preserve">The mechanism we propose for the TF-IDF gap is a</w:t>
       </w:r>
       <w:r>
         <w:t xml:space="preserve"> </w:t>
@@ -928,7 +1313,7 @@
         <w:t xml:space="preserve">representation-dependent diversity-utility tradeoff</w:t>
       </w:r>
       <w:r>
-        <w:t xml:space="preserve">. Critic-driven prompt updates inject surface variation that destroys keyword consistency at the unigram level, but that variation lives in a sub-manifold of the sentence-transformer's embedding space that the deeper representation reads as additional coverage of the real distribution. Direct measurements support this picture: the Mode Hunter accumulates 11.7 ± 0.6 distinct LLM-tic phrasings across 3 iterations and we verify each is suppressed; the loop-internal per-sample realism discriminator becomes</w:t>
+        <w:t xml:space="preserve">. Critic-driven prompt updates inject surface variation that destroys keyword consistency at the unigram level; this variation lives in a sub-manifold of the sentence-transformer's embedding space that the deeper representation tolerates rather than reads as noise. Direct measurements support that the GAN-style adversaries are functioning as designed: the Mode Hunter accumulates 11.7 ± 0.6 distinct LLM-tic phrasings across 3 iterations and we verify each is suppressed in subsequent generation; the loop-internal per-sample realism discriminator becomes</w:t>
       </w:r>
       <w:r>
         <w:t xml:space="preserve"> </w:t>
@@ -944,7 +1329,7 @@
         <w:t xml:space="preserve"> </w:t>
       </w:r>
       <w:r>
-        <w:t xml:space="preserve">confident in detecting synthetic patterns; the attribute-match rate stays below 10%; the post-hoc Pack Discriminator audit shows iterated conditions cluster near the real-vs-real null reference. These findings, together with the multi-classifier evaluation, are invisible to ablation tables that report only one classifier per row.</w:t>
+        <w:t xml:space="preserve">confident in detecting synthetic patterns through iteration (an honest negative finding); the attribute-match rate stays below 10%; the post-hoc Pack Discriminator audit shows iterated conditions cluster near the real-vs-real null reference. These signals are invisible to ablation tables that report only one downstream classifier per row.</w:t>
       </w:r>
     </w:p>
     <w:p>
@@ -10740,38 +11125,178 @@
         <w:widowControl w:val="1"/>
       </w:pPr>
       <w:r>
-        <w:t xml:space="preserve">Table 2b: Multi-classifier downstream macro F1 (mean ± std across 3 seeds). The same synthetic-data batches that yield the lowest TF-IDF score for</w:t>
-      </w:r>
-      <w:r>
-        <w:t xml:space="preserve"> </w:t>
-      </w:r>
-      <w:r>
-        <w:rPr>
-          <w:rStyle w:val="VerbatimChar"/>
-        </w:rPr>
-        <w:t xml:space="preserve">full_attrforge</w:t>
-      </w:r>
-      <w:r>
-        <w:t xml:space="preserve"> </w:t>
-      </w:r>
-      <w:r>
-        <w:t xml:space="preserve">yield the</w:t>
-      </w:r>
-      <w:r>
-        <w:t xml:space="preserve"> </w:t>
-      </w:r>
-      <w:r>
-        <w:rPr>
-          <w:i/>
-          <w:iCs/>
-        </w:rPr>
-        <w:t xml:space="preserve">highest</w:t>
-      </w:r>
-      <w:r>
-        <w:t xml:space="preserve"> </w:t>
-      </w:r>
-      <w:r>
-        <w:t xml:space="preserve">sentence-transformer score for the same condition. Bold cells are the best per-classifier-column.</w:t>
+        <w:t xml:space="preserve">Table 2b: Multi-classifier downstream macro F1 (mean ± std across 3 seeds). Bold cells are the best per-classifier column by mean. Under TF-IDF word features the 7-critic loop is reliably below the 3-critic loop across all 3 seeds (paired-t</w:t>
+      </w:r>
+      <w:r>
+        <w:t xml:space="preserve"> </w:t>
+      </w:r>
+      <m:oMath>
+        <m:r>
+          <m:t>p</m:t>
+        </m:r>
+        <m:r>
+          <m:rPr>
+            <m:sty m:val="p"/>
+          </m:rPr>
+          <m:t>=</m:t>
+        </m:r>
+        <m:r>
+          <m:t>0.09</m:t>
+        </m:r>
+      </m:oMath>
+      <w:r>
+        <w:t xml:space="preserve">, Wilcoxon</w:t>
+      </w:r>
+      <w:r>
+        <w:t xml:space="preserve"> </w:t>
+      </w:r>
+      <m:oMath>
+        <m:r>
+          <m:t>p</m:t>
+        </m:r>
+        <m:r>
+          <m:rPr>
+            <m:sty m:val="p"/>
+          </m:rPr>
+          <m:t>=</m:t>
+        </m:r>
+        <m:r>
+          <m:t>0.25</m:t>
+        </m:r>
+      </m:oMath>
+      <w:r>
+        <w:t xml:space="preserve">, 95% bootstrap CI</w:t>
+      </w:r>
+      <w:r>
+        <w:t xml:space="preserve"> </w:t>
+      </w:r>
+      <m:oMath>
+        <m:r>
+          <m:rPr>
+            <m:sty m:val="p"/>
+          </m:rPr>
+          <m:t>[</m:t>
+        </m:r>
+        <m:r>
+          <m:rPr>
+            <m:sty m:val="p"/>
+          </m:rPr>
+          <m:t>−</m:t>
+        </m:r>
+        <m:r>
+          <m:t>0.27</m:t>
+        </m:r>
+        <m:r>
+          <m:rPr>
+            <m:sty m:val="p"/>
+          </m:rPr>
+          <m:t>,</m:t>
+        </m:r>
+        <m:r>
+          <m:rPr>
+            <m:sty m:val="p"/>
+          </m:rPr>
+          <m:t>−</m:t>
+        </m:r>
+        <m:r>
+          <m:t>0.07</m:t>
+        </m:r>
+        <m:r>
+          <m:rPr>
+            <m:sty m:val="p"/>
+          </m:rPr>
+          <m:t>]</m:t>
+        </m:r>
+      </m:oMath>
+      <w:r>
+        <w:t xml:space="preserve"> </w:t>
+      </w:r>
+      <w:r>
+        <w:t xml:space="preserve">on the diff; underpowered but directional). Under sentence-transformer features the same comparison is statistically indistinguishable from zero (paired-t</w:t>
+      </w:r>
+      <w:r>
+        <w:t xml:space="preserve"> </w:t>
+      </w:r>
+      <m:oMath>
+        <m:r>
+          <m:t>p</m:t>
+        </m:r>
+        <m:r>
+          <m:rPr>
+            <m:sty m:val="p"/>
+          </m:rPr>
+          <m:t>=</m:t>
+        </m:r>
+        <m:r>
+          <m:t>0.66</m:t>
+        </m:r>
+      </m:oMath>
+      <w:r>
+        <w:t xml:space="preserve">, Wilcoxon</w:t>
+      </w:r>
+      <w:r>
+        <w:t xml:space="preserve"> </w:t>
+      </w:r>
+      <m:oMath>
+        <m:r>
+          <m:t>p</m:t>
+        </m:r>
+        <m:r>
+          <m:rPr>
+            <m:sty m:val="p"/>
+          </m:rPr>
+          <m:t>=</m:t>
+        </m:r>
+        <m:r>
+          <m:t>0.75</m:t>
+        </m:r>
+      </m:oMath>
+      <w:r>
+        <w:t xml:space="preserve">, CI</w:t>
+      </w:r>
+      <w:r>
+        <w:t xml:space="preserve"> </w:t>
+      </w:r>
+      <m:oMath>
+        <m:r>
+          <m:rPr>
+            <m:sty m:val="p"/>
+          </m:rPr>
+          <m:t>[</m:t>
+        </m:r>
+        <m:r>
+          <m:rPr>
+            <m:sty m:val="p"/>
+          </m:rPr>
+          <m:t>−</m:t>
+        </m:r>
+        <m:r>
+          <m:t>0.07</m:t>
+        </m:r>
+        <m:r>
+          <m:rPr>
+            <m:sty m:val="p"/>
+          </m:rPr>
+          <m:t>,</m:t>
+        </m:r>
+        <m:r>
+          <m:rPr>
+            <m:sty m:val="p"/>
+          </m:rPr>
+          <m:t>+</m:t>
+        </m:r>
+        <m:r>
+          <m:t>0.18</m:t>
+        </m:r>
+        <m:r>
+          <m:rPr>
+            <m:sty m:val="p"/>
+          </m:rPr>
+          <m:t>]</m:t>
+        </m:r>
+      </m:oMath>
+      <w:r>
+        <w:t xml:space="preserve">).</w:t>
       </w:r>
     </w:p>
     <w:tbl>
@@ -10780,7 +11305,7 @@
         <w:tblW w:type="pct" w:w="5000"/>
         <w:jc w:val="center"/>
         <w:tblLook w:firstRow="1" w:lastRow="0" w:firstColumn="0" w:lastColumn="0" w:noHBand="0" w:noVBand="0" w:val="0020"/>
-        <w:tblCaption w:val="Table 2b: Multi-classifier downstream macro F1 (mean ± std across 3 seeds). The same synthetic-data batches that yield the lowest TF-IDF score for full_attrforge yield the highest sentence-transformer score for the same condition. Bold cells are the best per-classifier-column."/>
+        <w:tblCaption w:val="Table 2b: Multi-classifier downstream macro F1 (mean ± std across 3 seeds). Bold cells are the best per-classifier column by mean. Under TF-IDF word features the 7-critic loop is reliably below the 3-critic loop across all 3 seeds (paired-t p=0.09, Wilcoxon p=0.25, 95% bootstrap CI [-0.27, -0.07] on the diff; underpowered but directional). Under sentence-transformer features the same comparison is statistically indistinguishable from zero (paired-t p=0.66, Wilcoxon p=0.75, CI [-0.07, +0.18])."/>
         <w:tblLayout w:type="autofit"/>
         <w:tblBorders>
           <w:top w:val="single" w:sz="10" w:color="4F6272"/>
@@ -11740,20 +12265,91 @@
         <w:widowControl w:val="1"/>
       </w:pPr>
       <w:r>
-        <w:t xml:space="preserve">The TF-IDF and sentence-transformer columns disagree about which condition produces the best synthetic data. With a TF-IDF classifier, the surface variation that the GAN-style adversaries inject reduces the keyword consistency that the classifier depends on, lowering F1 by 0.18. With a sentence-transformer classifier, the same surface variation provides a broader linguistic substrate that the deeper representation reads as</w:t>
-      </w:r>
-      <w:r>
-        <w:t xml:space="preserve"> </w:t>
-      </w:r>
-      <w:r>
-        <w:rPr>
-          <w:i/>
-          <w:iCs/>
-        </w:rPr>
-        <w:t xml:space="preserve">more useful coverage</w:t>
-      </w:r>
-      <w:r>
-        <w:t xml:space="preserve">, raising F1 by 0.04. The character</w:t>
+        <w:t xml:space="preserve">The three classifiers disagree about the ranking only under TF-IDF word features, where the 7-critic loop is systematically penalized. Under sentence-transformer features the 3-critic and 7-critic loops are statistically indistinguishable (paired-t</w:t>
+      </w:r>
+      <w:r>
+        <w:t xml:space="preserve"> </w:t>
+      </w:r>
+      <m:oMath>
+        <m:r>
+          <m:t>p</m:t>
+        </m:r>
+        <m:r>
+          <m:rPr>
+            <m:sty m:val="p"/>
+          </m:rPr>
+          <m:t>=</m:t>
+        </m:r>
+        <m:r>
+          <m:t>0.66</m:t>
+        </m:r>
+      </m:oMath>
+      <w:r>
+        <w:t xml:space="preserve">, Wilcoxon</w:t>
+      </w:r>
+      <w:r>
+        <w:t xml:space="preserve"> </w:t>
+      </w:r>
+      <m:oMath>
+        <m:r>
+          <m:t>p</m:t>
+        </m:r>
+        <m:r>
+          <m:rPr>
+            <m:sty m:val="p"/>
+          </m:rPr>
+          <m:t>=</m:t>
+        </m:r>
+        <m:r>
+          <m:t>0.75</m:t>
+        </m:r>
+      </m:oMath>
+      <w:r>
+        <w:t xml:space="preserve">, 95% bootstrap CI on the mean diff</w:t>
+      </w:r>
+      <w:r>
+        <w:t xml:space="preserve"> </w:t>
+      </w:r>
+      <m:oMath>
+        <m:r>
+          <m:rPr>
+            <m:sty m:val="p"/>
+          </m:rPr>
+          <m:t>[</m:t>
+        </m:r>
+        <m:r>
+          <m:rPr>
+            <m:sty m:val="p"/>
+          </m:rPr>
+          <m:t>−</m:t>
+        </m:r>
+        <m:r>
+          <m:t>0.073</m:t>
+        </m:r>
+        <m:r>
+          <m:rPr>
+            <m:sty m:val="p"/>
+          </m:rPr>
+          <m:t>,</m:t>
+        </m:r>
+        <m:r>
+          <m:rPr>
+            <m:sty m:val="p"/>
+          </m:rPr>
+          <m:t>+</m:t>
+        </m:r>
+        <m:r>
+          <m:t>0.180</m:t>
+        </m:r>
+        <m:r>
+          <m:rPr>
+            <m:sty m:val="p"/>
+          </m:rPr>
+          <m:t>]</m:t>
+        </m:r>
+      </m:oMath>
+      <w:r>
+        <w:t xml:space="preserve">, including zero). The character</w:t>
       </w:r>
       <w:r>
         <w:t xml:space="preserve"> </w:t>
@@ -11764,7 +12360,7 @@
         </m:r>
       </m:oMath>
       <w:r>
-        <w:t xml:space="preserve">-gram classifier sits in between:</w:t>
+        <w:t xml:space="preserve">-gram classifier sits between the two:</w:t>
       </w:r>
       <w:r>
         <w:t xml:space="preserve"> </w:t>
@@ -11779,7 +12375,7 @@
         <w:t xml:space="preserve"> </w:t>
       </w:r>
       <w:r>
-        <w:t xml:space="preserve">still wins (</w:t>
+        <w:t xml:space="preserve">still scores higher by mean (</w:t>
       </w:r>
       <m:oMath>
         <m:r>
@@ -11801,29 +12397,30 @@
         </m:r>
       </m:oMath>
       <w:r>
-        <w:t xml:space="preserve">), but the gap is smaller than on word features (</w:t>
+        <w:t xml:space="preserve">), but the gap is smaller than on word features. The strongest claim we can responsibly make from</w:t>
+      </w:r>
+      <w:r>
+        <w:t xml:space="preserve"> </w:t>
       </w:r>
       <m:oMath>
         <m:r>
-          <m:t>0.06</m:t>
+          <m:t>N</m:t>
+        </m:r>
+        <m:r>
+          <m:rPr>
+            <m:sty m:val="p"/>
+          </m:rPr>
+          <m:t>=</m:t>
+        </m:r>
+        <m:r>
+          <m:t>3</m:t>
         </m:r>
       </m:oMath>
       <w:r>
         <w:t xml:space="preserve"> </w:t>
       </w:r>
       <w:r>
-        <w:t xml:space="preserve">vs</w:t>
-      </w:r>
-      <w:r>
-        <w:t xml:space="preserve"> </w:t>
-      </w:r>
-      <m:oMath>
-        <m:r>
-          <m:t>0.18</m:t>
-        </m:r>
-      </m:oMath>
-      <w:r>
-        <w:t xml:space="preserve">). This is the central empirical contribution of the paper:</w:t>
+        <w:t xml:space="preserve">seeds is:</w:t>
       </w:r>
       <w:r>
         <w:t xml:space="preserve"> </w:t>
@@ -11833,10 +12430,10 @@
           <w:b/>
           <w:bCs/>
         </w:rPr>
-        <w:t xml:space="preserve">the diversity vs utility tradeoff is not a single property of the synthetic dataset, but a joint property of the dataset and the downstream classifier's representation capacity</w:t>
-      </w:r>
-      <w:r>
-        <w:t xml:space="preserve">.</w:t>
+        <w:t xml:space="preserve">the cost of the GAN adversaries to a low-capacity classifier vanishes when the downstream reader has access to dense embeddings, but we cannot conclude from these data that the adversaries help</w:t>
+      </w:r>
+      <w:r>
+        <w:t xml:space="preserve">. The classifier-dependence itself is the contribution: at the noise floor of a 10-item test set, single-classifier ablation tables produce ordering judgments that do not survive a classifier swap.</w:t>
       </w:r>
     </w:p>
     <w:p>

</xml_diff>

<commit_message>
Paper v0.7: simplify title, streamline abstract to one paragraph, drop subtitle/description
Title (was 26 words): "It Depends on the Classifier: GAN-Style Adversaries
in LLM Prompt Debugging Are Penalised by a TF-IDF Reader and Tolerated
by a Sentence-Transformer Reader"
Title (now 7 words): "Adversarial Prompt Debugging for LLM Synthetic Data Generation"

Subtitle paragraph removed entirely (the abstract carries that content).
Meta description tag removed; meta og:description removed (redundant
given og:title now matches the simplified title).

Abstract collapsed from 3 paragraphs to 1 dense paragraph (~200 words).
Carries the same TF-IDF / sentence-transformer split, the same
statistical analysis (paired diffs, CIs, p-values), and the same
"cost vanishes, not reverses" honest framing.

.docx download link in upper right made slightly more visible: 10pt
serif weight 600, padding bumped, full "Download .docx" label.

Co-Authored-By: Claude Opus 4.7 (1M context) <noreply@anthropic.com>
</commit_message>
<xml_diff>
--- a/docs/attrforge.docx
+++ b/docs/attrforge.docx
@@ -27,11 +27,11 @@
           <w:rPr>
             <w:rStyle w:val="Hyperlink"/>
           </w:rPr>
-          <w:t xml:space="preserve">.docx</w:t>
+          <w:t xml:space="preserve">Download .docx</w:t>
         </w:r>
       </w:hyperlink>
     </w:p>
-    <w:bookmarkStart w:id="10" w:name="X3c3319ed218187af625634b911eeefc8cbe4094"/>
+    <w:bookmarkStart w:id="10" w:name="Xdac8d92a33ef3993998ea70e90c831f7ca2cd58"/>
     <w:p>
       <w:pPr>
         <w:pStyle w:val="Title"/>
@@ -42,7 +42,7 @@
         <w:widowControl w:val="1"/>
       </w:pPr>
       <w:r>
-        <w:t xml:space="preserve">It Depends on the Classifier: GAN-Style Adversaries in LLM Prompt Debugging Are Penalised by a TF-IDF Reader and Tolerated by a Sentence-Transformer Reader</w:t>
+        <w:t xml:space="preserve">Adversarial Prompt Debugging for LLM Synthetic Data Generation</w:t>
       </w:r>
     </w:p>
     <w:p>
@@ -55,7 +55,39 @@
         <w:widowControl w:val="1"/>
       </w:pPr>
       <w:r>
-        <w:t xml:space="preserve">We adapt four GAN mode-collapse defenses (PacGAN, MSGAN, ban-list, density-ratio coverage) into a multi-critic LLM prompt-debugging loop. The seven-critic loop scores 0.18 macro F1 below a three-critic baseline when the downstream classifier is TF-IDF word features (directional 3/3 seeds; 95% bootstrap CI excludes zero; underpowered paired t p=0.09 at N=3). The gap disappears when the downstream classifier is a sentence-transformer (mean diff +0.04; CI [-0.07, 0.18] includes zero; not significant). We document this representation-dependent reading of the diversity-utility tradeoff and the post-hoc adversary audit protocol that makes it measurable.</w:t>
+        <w:rPr>
+          <w:b/>
+          <w:bCs/>
+        </w:rPr>
+        <w:t xml:space="preserve">Alexander Apartsin</w:t>
+      </w:r>
+      <w:r>
+        <w:rPr>
+          <w:vertAlign w:val="superscript"/>
+        </w:rPr>
+        <w:t xml:space="preserve">1</w:t>
+      </w:r>
+      <w:r>
+        <w:t xml:space="preserve"> </w:t>
+      </w:r>
+      <w:r>
+        <w:t xml:space="preserve"> </w:t>
+      </w:r>
+      <w:r>
+        <w:t xml:space="preserve"> </w:t>
+      </w:r>
+      <w:r>
+        <w:rPr>
+          <w:b/>
+          <w:bCs/>
+        </w:rPr>
+        <w:t xml:space="preserve">Yehudit Aperstein</w:t>
+      </w:r>
+      <w:r>
+        <w:rPr>
+          <w:vertAlign w:val="superscript"/>
+        </w:rPr>
+        <w:t xml:space="preserve">2</w:t>
       </w:r>
     </w:p>
     <w:p>
@@ -69,14 +101,6 @@
       </w:pPr>
       <w:r>
         <w:rPr>
-          <w:b/>
-          <w:bCs/>
-          <w:sz w:val="20"/>
-        </w:rPr>
-        <w:t xml:space="preserve">Alexander Apartsin</w:t>
-      </w:r>
-      <w:r>
-        <w:rPr>
           <w:sz w:val="20"/>
           <w:vertAlign w:val="superscript"/>
         </w:rPr>
@@ -86,27 +110,13 @@
         <w:rPr>
           <w:sz w:val="20"/>
         </w:rPr>
-        <w:t xml:space="preserve"> </w:t>
+        <w:t xml:space="preserve">Holon Institute of Technology, Israel  </w:t>
       </w:r>
       <w:r>
         <w:rPr>
           <w:sz w:val="20"/>
         </w:rPr>
-        <w:t xml:space="preserve"> </w:t>
-      </w:r>
-      <w:r>
-        <w:rPr>
-          <w:sz w:val="20"/>
-        </w:rPr>
-        <w:t xml:space="preserve"> </w:t>
-      </w:r>
-      <w:r>
-        <w:rPr>
-          <w:b/>
-          <w:bCs/>
-          <w:sz w:val="20"/>
-        </w:rPr>
-        <w:t xml:space="preserve">Yehudit Aperstein</w:t>
+        <w:t xml:space="preserve"> </w:t>
       </w:r>
       <w:r>
         <w:rPr>
@@ -115,6 +125,12 @@
         </w:rPr>
         <w:t xml:space="preserve">2</w:t>
       </w:r>
+      <w:r>
+        <w:rPr>
+          <w:sz w:val="20"/>
+        </w:rPr>
+        <w:t xml:space="preserve">Afeka College of Engineering, Israel</w:t>
+      </w:r>
     </w:p>
     <w:p>
       <w:pPr>
@@ -125,37 +141,7 @@
         <w:widowControl w:val="1"/>
       </w:pPr>
       <w:r>
-        <w:rPr>
-          <w:vertAlign w:val="superscript"/>
-        </w:rPr>
-        <w:t xml:space="preserve">1</w:t>
-      </w:r>
-      <w:r>
-        <w:t xml:space="preserve">Holon Institute of Technology, Israel  </w:t>
-      </w:r>
-      <w:r>
-        <w:t xml:space="preserve"> </w:t>
-      </w:r>
-      <w:r>
-        <w:rPr>
-          <w:vertAlign w:val="superscript"/>
-        </w:rPr>
-        <w:t xml:space="preserve">2</w:t>
-      </w:r>
-      <w:r>
-        <w:t xml:space="preserve">Afeka College of Engineering, Israel</w:t>
-      </w:r>
-    </w:p>
-    <w:p>
-      <w:pPr>
-        <w:pStyle w:val="BodyText"/>
-        <w:jc w:val="both"/>
-        <w:keepNext w:val="0"/>
-        <w:keepLines w:val="0"/>
-        <w:widowControl w:val="1"/>
-      </w:pPr>
-      <w:r>
-        <w:t xml:space="preserve">v0.6 · 2026</w:t>
+        <w:t xml:space="preserve">v0.7 · 2026</w:t>
       </w:r>
     </w:p>
     <w:bookmarkEnd w:id="10"/>
@@ -181,7 +167,10 @@
         <w:widowControl w:val="1"/>
       </w:pPr>
       <w:r>
-        <w:t xml:space="preserve">The diversity vs utility tradeoff in LLM-generated synthetic data is widely understood as a single-axis question: more variety, harder to classify. We show that whether that intuition holds depends on the capacity of the downstream classifier used to read the data. We adapt four classical GAN mode-collapse defenses (PacGAN, MSGAN, ban-list training, density-ratio coverage) into a multi-critic prompt-debugging loop combining them with three baseline LLM critics (attribute verifier, per-sample realism discriminator, diversity auditor), giving us a 3-critic baseline and a 7-critic loop that share the same harness and the same generator (</w:t>
+        <w:t xml:space="preserve">We adapt four classical GAN mode-collapse defenses (PacGAN, MSGAN, ban-list training, density-ratio coverage) into a multi-critic LLM prompt-debugging loop and combine them with three baseline LLM critics (attribute verifier, realism discriminator, diversity auditor) in a single open-source harness. On a customer-support intent classification task with</w:t>
+      </w:r>
+      <w:r>
+        <w:t xml:space="preserve"> </w:t>
       </w:r>
       <w:r>
         <w:rPr>
@@ -190,51 +179,73 @@
         <w:t xml:space="preserve">gpt-4o-mini</w:t>
       </w:r>
       <w:r>
-        <w:t xml:space="preserve">).</w:t>
-      </w:r>
-    </w:p>
-    <w:p>
-      <w:pPr>
-        <w:pStyle w:val="BodyText"/>
-        <w:jc w:val="both"/>
-        <w:keepNext w:val="0"/>
-        <w:keepLines w:val="0"/>
-        <w:widowControl w:val="1"/>
-      </w:pPr>
-      <w:r>
-        <w:t xml:space="preserve">Across 3 random seeds on a customer-support intent classification task, the gap between the 3-critic and 7-critic loops is mediated by the downstream classifier (Section 7). With TF-IDF word features and logistic regression, the 3-critic loop achieves macro F1</w:t>
-      </w:r>
-      <w:r>
-        <w:t xml:space="preserve"> </w:t>
-      </w:r>
-      <w:r>
-        <w:rPr>
-          <w:b/>
-          <w:bCs/>
-        </w:rPr>
-        <w:t xml:space="preserve">0.58 ± 0.05</w:t>
-      </w:r>
-      <w:r>
-        <w:t xml:space="preserve"> </w:t>
-      </w:r>
-      <w:r>
-        <w:t xml:space="preserve">on the held-out real test set; adding the 4 GAN-style adversaries drops F1 to</w:t>
-      </w:r>
-      <w:r>
-        <w:t xml:space="preserve"> </w:t>
-      </w:r>
-      <w:r>
-        <w:rPr>
-          <w:b/>
-          <w:bCs/>
-        </w:rPr>
-        <w:t xml:space="preserve">0.40 ± 0.06</w:t>
-      </w:r>
-      <w:r>
-        <w:t xml:space="preserve"> </w:t>
-      </w:r>
-      <w:r>
-        <w:t xml:space="preserve">(mean paired diff</w:t>
+        <w:t xml:space="preserve"> </w:t>
+      </w:r>
+      <w:r>
+        <w:t xml:space="preserve">across three random seeds, the seven-critic loop scores macro F1</w:t>
+      </w:r>
+      <w:r>
+        <w:t xml:space="preserve"> </w:t>
+      </w:r>
+      <m:oMath>
+        <m:r>
+          <m:t>0.40</m:t>
+        </m:r>
+        <m:r>
+          <m:rPr>
+            <m:sty m:val="p"/>
+          </m:rPr>
+          <m:t>±</m:t>
+        </m:r>
+        <m:r>
+          <m:t>0.06</m:t>
+        </m:r>
+      </m:oMath>
+      <w:r>
+        <w:t xml:space="preserve"> </w:t>
+      </w:r>
+      <w:r>
+        <w:t xml:space="preserve">against the three-critic baseline's</w:t>
+      </w:r>
+      <w:r>
+        <w:t xml:space="preserve"> </w:t>
+      </w:r>
+      <m:oMath>
+        <m:r>
+          <m:t>0.58</m:t>
+        </m:r>
+        <m:r>
+          <m:rPr>
+            <m:sty m:val="p"/>
+          </m:rPr>
+          <m:t>±</m:t>
+        </m:r>
+        <m:r>
+          <m:t>0.05</m:t>
+        </m:r>
+      </m:oMath>
+      <w:r>
+        <w:t xml:space="preserve"> </w:t>
+      </w:r>
+      <w:r>
+        <w:t xml:space="preserve">when the downstream classifier is TF-IDF</w:t>
+      </w:r>
+      <w:r>
+        <w:t xml:space="preserve"> </w:t>
+      </w:r>
+      <m:oMath>
+        <m:r>
+          <m:rPr>
+            <m:sty m:val="p"/>
+          </m:rPr>
+          <m:t>+</m:t>
+        </m:r>
+      </m:oMath>
+      <w:r>
+        <w:t xml:space="preserve"> </w:t>
+      </w:r>
+      <w:r>
+        <w:t xml:space="preserve">logistic regression (paired diff</w:t>
       </w:r>
       <w:r>
         <w:t xml:space="preserve"> </w:t>
@@ -295,7 +306,7 @@
         </m:r>
       </m:oMath>
       <w:r>
-        <w:t xml:space="preserve">, conventional paired-t</w:t>
+        <w:t xml:space="preserve">, directional 3/3 seeds, paired-t</w:t>
       </w:r>
       <w:r>
         <w:t xml:space="preserve"> </w:t>
@@ -318,29 +329,6 @@
         <w:t xml:space="preserve"> </w:t>
       </w:r>
       <w:r>
-        <w:t xml:space="preserve">and Wilcoxon</w:t>
-      </w:r>
-      <w:r>
-        <w:t xml:space="preserve"> </w:t>
-      </w:r>
-      <m:oMath>
-        <m:r>
-          <m:t>p</m:t>
-        </m:r>
-        <m:r>
-          <m:rPr>
-            <m:sty m:val="p"/>
-          </m:rPr>
-          <m:t>=</m:t>
-        </m:r>
-        <m:r>
-          <m:t>0.25</m:t>
-        </m:r>
-      </m:oMath>
-      <w:r>
-        <w:t xml:space="preserve"> </w:t>
-      </w:r>
-      <w:r>
         <w:t xml:space="preserve">at</w:t>
       </w:r>
       <w:r>
@@ -361,39 +349,7 @@
         </m:r>
       </m:oMath>
       <w:r>
-        <w:t xml:space="preserve">). All three seeds show the gap in the same direction. With sentence-transformer embeddings as features, the 3-critic loop scores</w:t>
-      </w:r>
-      <w:r>
-        <w:t xml:space="preserve"> </w:t>
-      </w:r>
-      <w:r>
-        <w:rPr>
-          <w:b/>
-          <w:bCs/>
-        </w:rPr>
-        <w:t xml:space="preserve">0.67 ± 0.13</w:t>
-      </w:r>
-      <w:r>
-        <w:t xml:space="preserve"> </w:t>
-      </w:r>
-      <w:r>
-        <w:t xml:space="preserve">and the 7-critic loop scores</w:t>
-      </w:r>
-      <w:r>
-        <w:t xml:space="preserve"> </w:t>
-      </w:r>
-      <w:r>
-        <w:rPr>
-          <w:b/>
-          <w:bCs/>
-        </w:rPr>
-        <w:t xml:space="preserve">0.71 ± 0.08</w:t>
-      </w:r>
-      <w:r>
-        <w:t xml:space="preserve">; the paired difference (mean</w:t>
-      </w:r>
-      <w:r>
-        <w:t xml:space="preserve"> </w:t>
+        <w:t xml:space="preserve">); the gap is statistically indistinguishable from zero (</w:t>
       </w:r>
       <m:oMath>
         <m:r>
@@ -451,7 +407,7 @@
         </m:r>
       </m:oMath>
       <w:r>
-        <w:t xml:space="preserve">, paired-t</w:t>
+        <w:t xml:space="preserve">,</w:t>
       </w:r>
       <w:r>
         <w:t xml:space="preserve"> </w:t>
@@ -471,84 +427,7 @@
         </m:r>
       </m:oMath>
       <w:r>
-        <w:t xml:space="preserve">, Wilcoxon</w:t>
-      </w:r>
-      <w:r>
-        <w:t xml:space="preserve"> </w:t>
-      </w:r>
-      <m:oMath>
-        <m:r>
-          <m:t>p</m:t>
-        </m:r>
-        <m:r>
-          <m:rPr>
-            <m:sty m:val="p"/>
-          </m:rPr>
-          <m:t>=</m:t>
-        </m:r>
-        <m:r>
-          <m:t>0.75</m:t>
-        </m:r>
-      </m:oMath>
-      <w:r>
-        <w:t xml:space="preserve">) is statistically indistinguishable from zero. The honest reading is that the 7-critic loop carries a measurable cost under a keyword-driven downstream reader and a cost that disappears under an embedding-based reader:</w:t>
-      </w:r>
-      <w:r>
-        <w:t xml:space="preserve"> </w:t>
-      </w:r>
-      <w:r>
-        <w:rPr>
-          <w:i/>
-          <w:iCs/>
-        </w:rPr>
-        <w:t xml:space="preserve">the disadvantage flips into a tie, not a reversal</w:t>
-      </w:r>
-      <w:r>
-        <w:t xml:space="preserve">.</w:t>
-      </w:r>
-    </w:p>
-    <w:p>
-      <w:pPr>
-        <w:pStyle w:val="BodyText"/>
-        <w:jc w:val="both"/>
-        <w:keepNext w:val="0"/>
-        <w:keepLines w:val="0"/>
-        <w:widowControl w:val="1"/>
-      </w:pPr>
-      <w:r>
-        <w:t xml:space="preserve">Beyond this main result we release: (i) an open-source seven-critic harness with a single-flag-per-critic ablation contract; (ii) a</w:t>
-      </w:r>
-      <w:r>
-        <w:t xml:space="preserve"> </w:t>
-      </w:r>
-      <w:r>
-        <w:rPr>
-          <w:i/>
-          <w:iCs/>
-        </w:rPr>
-        <w:t xml:space="preserve">post-hoc adversary audit</w:t>
-      </w:r>
-      <w:r>
-        <w:t xml:space="preserve"> </w:t>
-      </w:r>
-      <w:r>
-        <w:t xml:space="preserve">that re-runs every critic against every condition's final batch with re-seeded RNG and a real-vs-real null reference, breaking the tautological-firing failure mode of naive ablation tables; (iii) a complaint-grammar contract that lets future work add new critics without breaking the protocol; (iv) two honest negative findings (loop-internal realism discriminator drifts</w:t>
-      </w:r>
-      <w:r>
-        <w:t xml:space="preserve"> </w:t>
-      </w:r>
-      <w:r>
-        <w:rPr>
-          <w:i/>
-          <w:iCs/>
-        </w:rPr>
-        <w:t xml:space="preserve">away</w:t>
-      </w:r>
-      <w:r>
-        <w:t xml:space="preserve"> </w:t>
-      </w:r>
-      <w:r>
-        <w:t xml:space="preserve">from chance under iteration; the Coverage Hole Finder's density-ratio classifier remains at AUROC</w:t>
+        <w:t xml:space="preserve">) when the same batches are read by sentence-transformer embeddings. We argue the cost of the GAN-style adversaries is real under a keyword-driven downstream classifier and not detectable under an embedding-based one, and we report this as the central diversity-utility finding rather than the more dramatic but unsupported "reversal" we initially expected. We also contribute a post-hoc adversary audit protocol that re-runs every critic against every condition's final batch with re-seeded RNG and a real-vs-real null reference (defusing the tautological-firing failure mode of naive ablation tables), a complaint-grammar contract that lets future work add new critics without breaking the protocol, and two honest negative findings (loop-internal realism discriminator drifts away from chance through iteration; Coverage Hole AUROC remains at</w:t>
       </w:r>
       <w:r>
         <w:t xml:space="preserve"> </w:t>
@@ -562,7 +441,7 @@
         <w:t xml:space="preserve"> </w:t>
       </w:r>
       <w:r>
-        <w:t xml:space="preserve">across all conditions); and (v) per-iteration on-disk manifests sufficient for byte-for-byte reproduction.</w:t>
+        <w:t xml:space="preserve">on every condition).</w:t>
       </w:r>
     </w:p>
     <w:bookmarkEnd w:id="11"/>

</xml_diff>

<commit_message>
Paper v0.7.4: standardize table numbering 1-5, add diversity-metrics script
Tables renumbered for consistency: Table 0 -> 1 (complaint grammar);
Table 1 -> 2 (conditions); Table 2 -> 3 (per-condition metrics);
Table 2b -> 4 (multi-classifier); Table 3 -> 5 (post-hoc audit).
All cross-references updated.

Removed a stale Table 2 reference in Section 7.2 that pre-dated the
multi-classifier addition and falsely claimed full_attrforge 'exactly
matches' downstream metrics across all iterated conditions.

Added scripts/diversity_metrics.py: computes distinct-1/2/3 and
self-BLEU-4 on every condition's final pooled batch across all
available seeds. Output saved at experiments/main_run_002_aggregated/
diversity_metrics.csv. Will be incorporated into the paper once the
5-seed run completes.

Co-Authored-By: Claude Opus 4.7 (1M context) <noreply@anthropic.com>
</commit_message>
<xml_diff>
--- a/docs/attrforge.docx
+++ b/docs/attrforge.docx
@@ -3943,7 +3943,7 @@
           <w:b/>
           <w:bCs/>
         </w:rPr>
-        <w:t xml:space="preserve">Table 0</w:t>
+        <w:t xml:space="preserve">Table 1</w:t>
       </w:r>
       <w:r>
         <w:t xml:space="preserve"> </w:t>
@@ -3964,7 +3964,7 @@
           <w:b/>
           <w:i/>
         </w:rPr>
-        <w:t>Table 0:</w:t>
+        <w:t>Table 1:</w:t>
       </w:r>
       <w:r>
         <w:rPr>
@@ -3987,7 +3987,7 @@
         <w:tblW w:type="pct" w:w="5000"/>
         <w:jc w:val="center"/>
         <w:tblLook w:firstRow="1" w:lastRow="0" w:firstColumn="0" w:lastColumn="0" w:noHBand="0" w:noVBand="0" w:val="0020"/>
-        <w:tblCaption w:val="Table 0: The complaint grammar of each critic. Each row gives the structured output the critic emits, and the kind of locally-targeted rewrite the updater can produce in response. Bottom four rows are the new GAN-style adversaries introduced in this paper."/>
+        <w:tblCaption w:val="Table 1: The complaint grammar of each critic. Each row gives the structured output the critic emits, and the kind of locally-targeted rewrite the updater can produce in response. Bottom four rows are the new GAN-style adversaries introduced in this paper."/>
         <w:tblLayout w:type="autofit"/>
         <w:tblBorders>
           <w:top w:val="single" w:sz="10" w:color="4F6272"/>
@@ -6117,7 +6117,7 @@
           <w:b/>
           <w:i/>
         </w:rPr>
-        <w:t>Table 1:</w:t>
+        <w:t>Table 2:</w:t>
       </w:r>
       <w:r>
         <w:rPr>
@@ -6131,7 +6131,7 @@
           <w:b w:val="0"/>
           <w:i/>
         </w:rPr>
-        <w:t>Conditions evaluated. Same generator (live gpt-4o-mini, temperature 0.9), same three random seeds (17, 23, 41), same dataset, same downstream evaluator. The conditions differ in which critics are enabled and in two non-critic settings: naive and few_shot use 1 iteration of 16 samples (16 total); the other five use 3 iterations of 16 samples (48 total). few_shot additionally bumps the generator's few-shot pool from 3 to 8 real exemplars. These non-critic differences are part of the standard baselines literature (one-shot vs few-shot vs iterated); they affect what each condition is meant to measure rather than being a confound, but Section 9.1 quantifies their contribution.</w:t>
+        <w:t>Conditions evaluated. Same generator (live gpt-4o-mini, temperature 0.9), same three random seeds (17, 23, 41), same dataset, same downstream evaluator. The conditions differ in which critics are enabled and in two non-critic settings: naive and few_shot use 1 iteration of 16 samples (16 total); the other five use 3 iterations of 16 samples (48 total). few_shot additionally bumps the generator's few-shot pool from 3 to 8 real exemplars. These non-critic differences are part of the standard baselines literature (one-shot vs few-shot vs iterated); they affect what each condition is meant to measure rather than being a confound.</w:t>
       </w:r>
     </w:p>
     <w:tbl>
@@ -6140,7 +6140,7 @@
         <w:tblW w:type="pct" w:w="5000"/>
         <w:jc w:val="center"/>
         <w:tblLook w:firstRow="1" w:lastRow="0" w:firstColumn="0" w:lastColumn="0" w:noHBand="0" w:noVBand="0" w:val="0020"/>
-        <w:tblCaption w:val="Table 1: Conditions evaluated. Same generator (live gpt-4o-mini, temperature 0.9), same three random seeds (17, 23, 41), same dataset, same downstream evaluator. The conditions differ in which critics are enabled and in two non-critic settings: naive and few_shot use 1 iteration of 16 samples (16 total); the other five use 3 iterations of 16 samples (48 total). few_shot additionally bumps the generator's few-shot pool from 3 to 8 real exemplars. These non-critic differences are part of the standard baselines literature (one-shot vs few-shot vs iterated); they affect what each condition is meant to measure rather than being a confound, but Section 9.1 quantifies their contribution."/>
+        <w:tblCaption w:val="Table 2: Conditions evaluated. Same generator (live gpt-4o-mini, temperature 0.9), same three random seeds (17, 23, 41), same dataset, same downstream evaluator. The conditions differ in which critics are enabled and in two non-critic settings: naive and few_shot use 1 iteration of 16 samples (16 total); the other five use 3 iterations of 16 samples (48 total). few_shot additionally bumps the generator's few-shot pool from 3 to 8 real exemplars. These non-critic differences are part of the standard baselines literature (one-shot vs few-shot vs iterated); they affect what each condition is meant to measure rather than being a confound."/>
         <w:tblLayout w:type="autofit"/>
         <w:tblBorders>
           <w:top w:val="single" w:sz="10" w:color="4F6272"/>
@@ -8656,7 +8656,7 @@
           <w:b/>
           <w:i/>
         </w:rPr>
-        <w:t>Table 2:</w:t>
+        <w:t>Table 3:</w:t>
       </w:r>
       <w:r>
         <w:rPr>
@@ -8670,7 +8670,7 @@
           <w:b w:val="0"/>
           <w:i/>
         </w:rPr>
-        <w:t>Per-condition metrics at the final iteration, mean ± std over 3 random seeds, live gpt-4o-mini. "n/a" indicates a critic was disabled in that condition (metric not computed during the loop). Post-hoc adversary audit numbers, where every critic runs against every condition, are reported in Section 8 Table 3. Bold cells highlight the tradeoff: full_classic dominates downstream F1; adding the 4 GAN adversaries drops F1 by 0.18 absolute.</w:t>
+        <w:t>Per-condition metrics at the final iteration, mean ± std over 3 random seeds, live gpt-4o-mini. "n/a" indicates a critic was disabled in that condition (metric not computed during the loop). Post-hoc adversary audit numbers, where every critic runs against every condition, are reported in Section 8 Table 5. Bold cells highlight the TF-IDF gap: full_classic dominates downstream F1 under TF-IDF features; adding the 4 GAN adversaries drops F1 by 0.18 absolute (directional 3/3 seeds, underpowered at ).</w:t>
       </w:r>
     </w:p>
     <w:tbl>
@@ -8679,7 +8679,7 @@
         <w:tblW w:type="pct" w:w="5000"/>
         <w:jc w:val="center"/>
         <w:tblLook w:firstRow="1" w:lastRow="0" w:firstColumn="0" w:lastColumn="0" w:noHBand="0" w:noVBand="0" w:val="0020"/>
-        <w:tblCaption w:val="Table 2: Per-condition metrics at the final iteration, mean ± std over 3 random seeds, live gpt-4o-mini. &quot;n/a&quot; indicates a critic was disabled in that condition (metric not computed during the loop). Post-hoc adversary audit numbers, where every critic runs against every condition, are reported in Section 8 Table 3. Bold cells highlight the tradeoff: full_classic dominates downstream F1; adding the 4 GAN adversaries drops F1 by 0.18 absolute."/>
+        <w:tblCaption w:val="Table 3: Per-condition metrics at the final iteration, mean ± std over 3 random seeds, live gpt-4o-mini. &quot;n/a&quot; indicates a critic was disabled in that condition (metric not computed during the loop). Post-hoc adversary audit numbers, where every critic runs against every condition, are reported in Section 8 Table 5. Bold cells highlight the TF-IDF gap: full_classic dominates downstream F1 under TF-IDF features; adding the 4 GAN adversaries drops F1 by 0.18 absolute (directional 3/3 seeds, underpowered at N=3)."/>
         <w:tblLayout w:type="autofit"/>
         <w:tblBorders>
           <w:top w:val="single" w:sz="10" w:color="4F6272"/>
@@ -10075,7 +10075,7 @@
         <w:widowControl w:val="1"/>
       </w:pPr>
       <w:r>
-        <w:t xml:space="preserve">Three observations from Table 2.</w:t>
+        <w:t xml:space="preserve">Three observations from Table 3.</w:t>
       </w:r>
       <w:r>
         <w:t xml:space="preserve"> </w:t>
@@ -10809,185 +10809,31 @@
     </w:p>
     <w:p>
       <w:pPr>
-        <w:pStyle w:val="BodyText"/>
-        <w:jc w:val="both"/>
-        <w:keepNext w:val="0"/>
-        <w:keepLines w:val="0"/>
+        <w:spacing w:before="160" w:after="60" w:line="240" w:lineRule="auto"/>
+        <w:keepNext/>
+        <w:keepLines/>
         <w:widowControl w:val="1"/>
       </w:pPr>
       <w:r>
-        <w:t xml:space="preserve">Table 2b: Multi-classifier downstream macro F1 (mean ± std across 3 seeds). Bold cells are the best per-classifier column by mean. Under TF-IDF word features the 7-critic loop is reliably below the 3-critic loop across all 3 seeds (paired-t</w:t>
-      </w:r>
-      <w:r>
-        <w:t xml:space="preserve"> </w:t>
-      </w:r>
-      <m:oMath>
-        <m:r>
-          <m:t>p</m:t>
-        </m:r>
-        <m:r>
-          <m:rPr>
-            <m:sty m:val="p"/>
-          </m:rPr>
-          <m:t>=</m:t>
-        </m:r>
-        <m:r>
-          <m:t>0.09</m:t>
-        </m:r>
-      </m:oMath>
-      <w:r>
-        <w:t xml:space="preserve">, Wilcoxon</w:t>
-      </w:r>
-      <w:r>
-        <w:t xml:space="preserve"> </w:t>
-      </w:r>
-      <m:oMath>
-        <m:r>
-          <m:t>p</m:t>
-        </m:r>
-        <m:r>
-          <m:rPr>
-            <m:sty m:val="p"/>
-          </m:rPr>
-          <m:t>=</m:t>
-        </m:r>
-        <m:r>
-          <m:t>0.25</m:t>
-        </m:r>
-      </m:oMath>
-      <w:r>
-        <w:t xml:space="preserve">, 95% bootstrap CI</w:t>
-      </w:r>
-      <w:r>
-        <w:t xml:space="preserve"> </w:t>
-      </w:r>
-      <m:oMath>
-        <m:r>
-          <m:rPr>
-            <m:sty m:val="p"/>
-          </m:rPr>
-          <m:t>[</m:t>
-        </m:r>
-        <m:r>
-          <m:rPr>
-            <m:sty m:val="p"/>
-          </m:rPr>
-          <m:t>−</m:t>
-        </m:r>
-        <m:r>
-          <m:t>0.27</m:t>
-        </m:r>
-        <m:r>
-          <m:rPr>
-            <m:sty m:val="p"/>
-          </m:rPr>
-          <m:t>,</m:t>
-        </m:r>
-        <m:r>
-          <m:rPr>
-            <m:sty m:val="p"/>
-          </m:rPr>
-          <m:t>−</m:t>
-        </m:r>
-        <m:r>
-          <m:t>0.07</m:t>
-        </m:r>
-        <m:r>
-          <m:rPr>
-            <m:sty m:val="p"/>
-          </m:rPr>
-          <m:t>]</m:t>
-        </m:r>
-      </m:oMath>
-      <w:r>
-        <w:t xml:space="preserve"> </w:t>
-      </w:r>
-      <w:r>
-        <w:t xml:space="preserve">on the diff; underpowered but directional). Under sentence-transformer features the same comparison is statistically indistinguishable from zero (paired-t</w:t>
-      </w:r>
-      <w:r>
-        <w:t xml:space="preserve"> </w:t>
-      </w:r>
-      <m:oMath>
-        <m:r>
-          <m:t>p</m:t>
-        </m:r>
-        <m:r>
-          <m:rPr>
-            <m:sty m:val="p"/>
-          </m:rPr>
-          <m:t>=</m:t>
-        </m:r>
-        <m:r>
-          <m:t>0.66</m:t>
-        </m:r>
-      </m:oMath>
-      <w:r>
-        <w:t xml:space="preserve">, Wilcoxon</w:t>
-      </w:r>
-      <w:r>
-        <w:t xml:space="preserve"> </w:t>
-      </w:r>
-      <m:oMath>
-        <m:r>
-          <m:t>p</m:t>
-        </m:r>
-        <m:r>
-          <m:rPr>
-            <m:sty m:val="p"/>
-          </m:rPr>
-          <m:t>=</m:t>
-        </m:r>
-        <m:r>
-          <m:t>0.75</m:t>
-        </m:r>
-      </m:oMath>
-      <w:r>
-        <w:t xml:space="preserve">, CI</w:t>
-      </w:r>
-      <w:r>
-        <w:t xml:space="preserve"> </w:t>
-      </w:r>
-      <m:oMath>
-        <m:r>
-          <m:rPr>
-            <m:sty m:val="p"/>
-          </m:rPr>
-          <m:t>[</m:t>
-        </m:r>
-        <m:r>
-          <m:rPr>
-            <m:sty m:val="p"/>
-          </m:rPr>
-          <m:t>−</m:t>
-        </m:r>
-        <m:r>
-          <m:t>0.07</m:t>
-        </m:r>
-        <m:r>
-          <m:rPr>
-            <m:sty m:val="p"/>
-          </m:rPr>
-          <m:t>,</m:t>
-        </m:r>
-        <m:r>
-          <m:rPr>
-            <m:sty m:val="p"/>
-          </m:rPr>
-          <m:t>+</m:t>
-        </m:r>
-        <m:r>
-          <m:t>0.18</m:t>
-        </m:r>
-        <m:r>
-          <m:rPr>
-            <m:sty m:val="p"/>
-          </m:rPr>
-          <m:t>]</m:t>
-        </m:r>
-      </m:oMath>
-      <w:r>
-        <w:t xml:space="preserve">).</w:t>
+        <w:rPr>
+          <w:b/>
+          <w:i/>
+        </w:rPr>
+        <w:t>Table 4:</w:t>
+      </w:r>
+      <w:r>
+        <w:rPr>
+          <w:b w:val="0"/>
+          <w:i/>
+        </w:rPr>
+        <w:t xml:space="preserve"> </w:t>
+      </w:r>
+      <w:r>
+        <w:rPr>
+          <w:b w:val="0"/>
+          <w:i/>
+        </w:rPr>
+        <w:t>Multi-classifier downstream macro F1 (mean ± std across 3 seeds). Bold cells are the best per-classifier column by mean. Under TF-IDF word features the 7-critic loop is reliably below the 3-critic loop across all 3 seeds (paired-t , Wilcoxon , 95% bootstrap CI  on the diff; underpowered but directional). Under sentence-transformer features the same comparison is statistically indistinguishable from zero (paired-t , Wilcoxon , CI ).</w:t>
       </w:r>
     </w:p>
     <w:tbl>
@@ -10996,7 +10842,7 @@
         <w:tblW w:type="pct" w:w="5000"/>
         <w:jc w:val="center"/>
         <w:tblLook w:firstRow="1" w:lastRow="0" w:firstColumn="0" w:lastColumn="0" w:noHBand="0" w:noVBand="0" w:val="0020"/>
-        <w:tblCaption w:val="Table 2b: Multi-classifier downstream macro F1 (mean ± std across 3 seeds). Bold cells are the best per-classifier column by mean. Under TF-IDF word features the 7-critic loop is reliably below the 3-critic loop across all 3 seeds (paired-t p=0.09, Wilcoxon p=0.25, 95% bootstrap CI [-0.27, -0.07] on the diff; underpowered but directional). Under sentence-transformer features the same comparison is statistically indistinguishable from zero (paired-t p=0.66, Wilcoxon p=0.75, CI [-0.07, +0.18])."/>
+        <w:tblCaption w:val="Table 4: Multi-classifier downstream macro F1 (mean ± std across 3 seeds). Bold cells are the best per-classifier column by mean. Under TF-IDF word features the 7-critic loop is reliably below the 3-critic loop across all 3 seeds (paired-t p=0.09, Wilcoxon p=0.25, 95% bootstrap CI [-0.27, -0.07] on the diff; underpowered but directional). Under sentence-transformer features the same comparison is statistically indistinguishable from zero (paired-t p=0.66, Wilcoxon p=0.75, CI [-0.07, +0.18])."/>
         <w:tblLayout w:type="autofit"/>
         <w:tblBorders>
           <w:top w:val="single" w:sz="10" w:color="4F6272"/>
@@ -12148,7 +11994,7 @@
         <w:widowControl w:val="1"/>
       </w:pPr>
       <w:r>
-        <w:t xml:space="preserve">Two observations from Table 2 and Figure 2. First, on this</w:t>
+        <w:t xml:space="preserve">Two observations from Table 3 and Figure 2. First, the downstream metric on this</w:t>
       </w:r>
       <w:r>
         <w:t xml:space="preserve"> </w:t>
@@ -12184,7 +12030,21 @@
         <w:t xml:space="preserve"> </w:t>
       </w:r>
       <w:r>
-        <w:t xml:space="preserve">task the downstream metric saturates the moment a condition gets 48 training samples regardless of which critics are enabled, so the downstream metric alone cannot distinguish AttrForge from other iterated baselines. Second, the only loop-internal metric where</w:t>
+        <w:t xml:space="preserve">task carries a wide noise floor; any TF-IDF F1 difference smaller than about</w:t>
+      </w:r>
+      <w:r>
+        <w:t xml:space="preserve"> </w:t>
+      </w:r>
+      <m:oMath>
+        <m:r>
+          <m:t>0.10</m:t>
+        </m:r>
+      </m:oMath>
+      <w:r>
+        <w:t xml:space="preserve"> </w:t>
+      </w:r>
+      <w:r>
+        <w:t xml:space="preserve">is within seed-std for several conditions. Second, the only loop-internal metric where</w:t>
       </w:r>
       <w:r>
         <w:t xml:space="preserve"> </w:t>
@@ -12214,72 +12074,51 @@
         <w:t xml:space="preserve"> </w:t>
       </w:r>
       <w:r>
-        <w:t xml:space="preserve">by more than one seed-std is the realism discriminator accuracy:</w:t>
+        <w:t xml:space="preserve">by more than one seed-std is the realism discriminator accuracy, where</w:t>
+      </w:r>
+      <w:r>
+        <w:t xml:space="preserve"> </w:t>
+      </w:r>
+      <w:r>
+        <w:rPr>
+          <w:rStyle w:val="VerbatimChar"/>
+        </w:rPr>
+        <w:t xml:space="preserve">full_attrforge</w:t>
+      </w:r>
+      <w:r>
+        <w:t xml:space="preserve"> </w:t>
+      </w:r>
+      <w:r>
+        <w:t xml:space="preserve">sits</w:t>
       </w:r>
       <w:r>
         <w:t xml:space="preserve"> </w:t>
       </w:r>
       <m:oMath>
         <m:r>
-          <m:t>0.69</m:t>
-        </m:r>
-        <m:r>
-          <m:rPr>
-            <m:sty m:val="p"/>
-          </m:rPr>
-          <m:t>±</m:t>
-        </m:r>
-        <m:r>
-          <m:t>0.06</m:t>
+          <m:t>0.09</m:t>
         </m:r>
       </m:oMath>
       <w:r>
         <w:t xml:space="preserve"> </w:t>
       </w:r>
       <w:r>
-        <w:t xml:space="preserve">vs</w:t>
-      </w:r>
-      <w:r>
-        <w:t xml:space="preserve"> </w:t>
-      </w:r>
-      <m:oMath>
-        <m:r>
-          <m:t>0.72</m:t>
-        </m:r>
-        <m:r>
-          <m:rPr>
-            <m:sty m:val="p"/>
-          </m:rPr>
-          <m:t>±</m:t>
-        </m:r>
-        <m:r>
-          <m:t>0.10</m:t>
-        </m:r>
-      </m:oMath>
-      <w:r>
-        <w:t xml:space="preserve">. The full AttrForge stack moves the realism objective</w:t>
-      </w:r>
-      <w:r>
-        <w:t xml:space="preserve"> </w:t>
-      </w:r>
-      <m:oMath>
-        <m:r>
-          <m:t>0.03</m:t>
-        </m:r>
-      </m:oMath>
-      <w:r>
-        <w:t xml:space="preserve"> </w:t>
-      </w:r>
-      <w:r>
-        <w:t xml:space="preserve">closer to chance than the three-critic baseline, while exactly matching it on attribute fidelity (</w:t>
-      </w:r>
-      <m:oMath>
-        <m:r>
-          <m:t>1.00</m:t>
-        </m:r>
-      </m:oMath>
-      <w:r>
-        <w:t xml:space="preserve">) and downstream metrics.</w:t>
+        <w:t xml:space="preserve">closer to chance than</w:t>
+      </w:r>
+      <w:r>
+        <w:t xml:space="preserve"> </w:t>
+      </w:r>
+      <w:r>
+        <w:rPr>
+          <w:rStyle w:val="VerbatimChar"/>
+        </w:rPr>
+        <w:t xml:space="preserve">full_classic</w:t>
+      </w:r>
+      <w:r>
+        <w:t xml:space="preserve"> </w:t>
+      </w:r>
+      <w:r>
+        <w:t xml:space="preserve">(Table 3). On attribute fidelity, both verifier-using conditions are below 10% match.</w:t>
       </w:r>
     </w:p>
     <w:bookmarkEnd w:id="40"/>
@@ -12638,7 +12477,7 @@
         <w:widowControl w:val="1"/>
       </w:pPr>
       <w:r>
-        <w:t xml:space="preserve">Table 2's "n/a" entries are a structural symptom of the experimental design: a critic's metric is computed only when that critic is enabled in the loop. So when we report "Pack accuracy</w:t>
+        <w:t xml:space="preserve">Table 3's "n/a" entries are a structural symptom of the experimental design: a critic's metric is computed only when that critic is enabled in the loop. So when we report "Pack accuracy</w:t>
       </w:r>
       <w:r>
         <w:t xml:space="preserve"> </w:t>
@@ -12877,7 +12716,7 @@
           <w:b/>
           <w:i/>
         </w:rPr>
-        <w:t>Table 3:</w:t>
+        <w:t>Table 5:</w:t>
       </w:r>
       <w:r>
         <w:rPr>
@@ -12891,7 +12730,7 @@
           <w:b w:val="0"/>
           <w:i/>
         </w:rPr>
-        <w:t>Post-hoc adversary audit on the live-LLM run (main_run_002, mean ± std across 3 random seeds). Every critic is re-run on every condition's final pooled batch with RNG re-seeded per condition. The real-vs-real null reference (computed once) is  in this domain. Pack accuracy below null indicates the synthetic batch is at-least-as-diverse as the real seed set; above null indicates collapse. The loop disc. acc. column is the loop-internal realism discriminator score from Table 2 reproduced here for context; it is not part of the post-hoc audit.</w:t>
+        <w:t>Post-hoc adversary audit on the live-LLM run (main_run_002, mean ± std across 3 random seeds). Every critic is re-run on every condition's final pooled batch with RNG re-seeded per condition. The real-vs-real null reference (computed once) is  in this domain. Pack accuracy below null indicates the synthetic batch is at-least-as-diverse as the real seed set; above null indicates collapse. The loop disc. acc. column is the loop-internal realism discriminator score from Table 3 reproduced here for context; it is not part of the post-hoc audit.</w:t>
       </w:r>
     </w:p>
     <w:tbl>
@@ -12900,7 +12739,7 @@
         <w:tblW w:type="pct" w:w="5000"/>
         <w:jc w:val="center"/>
         <w:tblLook w:firstRow="1" w:lastRow="0" w:firstColumn="0" w:lastColumn="0" w:noHBand="0" w:noVBand="0" w:val="0020"/>
-        <w:tblCaption w:val="Table 3: Post-hoc adversary audit on the live-LLM run (main_run_002, mean ± std across 3 random seeds). Every critic is re-run on every condition's final pooled batch with RNG re-seeded per condition. The real-vs-real null reference (computed once) is \mathrm{PackAcc}_{\text{null}} = 0.54 in this domain. Pack accuracy below null indicates the synthetic batch is at-least-as-diverse as the real seed set; above null indicates collapse. The loop disc. acc. column is the loop-internal realism discriminator score from Table 2 reproduced here for context; it is not part of the post-hoc audit."/>
+        <w:tblCaption w:val="Table 5: Post-hoc adversary audit on the live-LLM run (main_run_002, mean ± std across 3 random seeds). Every critic is re-run on every condition's final pooled batch with RNG re-seeded per condition. The real-vs-real null reference (computed once) is \mathrm{PackAcc}_{\text{null}} = 0.54 in this domain. Pack accuracy below null indicates the synthetic batch is at-least-as-diverse as the real seed set; above null indicates collapse. The loop disc. acc. column is the loop-internal realism discriminator score from Table 3 reproduced here for context; it is not part of the post-hoc audit."/>
         <w:tblLayout w:type="autofit"/>
         <w:tblBorders>
           <w:top w:val="single" w:sz="10" w:color="4F6272"/>

</xml_diff>